<commit_message>
Put Group 11 and its members on the report's cover
Co-Authored-By: Claude Opus 5.5 <noreply@anthropic.com>
Claude-Session: https://claude.ai/code/session_012tam43Wrx3VFhnLz3rDLzg
</commit_message>
<xml_diff>
--- a/artifacts/ClinicOS_DesignThinking_Report.docx
+++ b/artifacts/ClinicOS_DesignThinking_Report.docx
@@ -4,7 +4,7 @@
   <w:body>
     <w:p>
       <w:pPr>
-        <w:spacing w:after="1400"/>
+        <w:spacing w:after="500"/>
       </w:pPr>
     </w:p>
     <w:p>
@@ -27,7 +27,7 @@
     </w:p>
     <w:p>
       <w:pPr>
-        <w:spacing w:after="900"/>
+        <w:spacing w:after="600"/>
         <w:jc w:val="center"/>
       </w:pPr>
       <w:r>
@@ -59,7 +59,7 @@
         <w:jc w:val="center"/>
       </w:pPr>
       <w:r>
-        <w:t xml:space="preserve">Varaxis</w:t>
+        <w:t xml:space="preserve">Group 11</w:t>
       </w:r>
     </w:p>
     <w:p>
@@ -77,14 +77,744 @@
         <w:t xml:space="preserve">Member Details</w:t>
       </w:r>
     </w:p>
-    <w:p>
-      <w:pPr>
-        <w:spacing w:after="500"/>
+    <w:tbl>
+      <w:tblPr>
+        <w:tblW w:type="dxa" w:w="7300"/>
         <w:jc w:val="center"/>
-      </w:pPr>
-      <w:r>
-        <w:t xml:space="preserve">SHREYA BISWAS – 0070</w:t>
-      </w:r>
+        <w:tblBorders>
+          <w:top w:val="single" w:color="auto" w:sz="4"/>
+          <w:left w:val="single" w:color="auto" w:sz="4"/>
+          <w:bottom w:val="single" w:color="auto" w:sz="4"/>
+          <w:right w:val="single" w:color="auto" w:sz="4"/>
+          <w:insideH w:val="single" w:color="auto" w:sz="4"/>
+          <w:insideV w:val="single" w:color="auto" w:sz="4"/>
+        </w:tblBorders>
+      </w:tblPr>
+      <w:tblGrid>
+        <w:gridCol w:w="900"/>
+        <w:gridCol w:w="3600"/>
+        <w:gridCol w:w="2800"/>
+      </w:tblGrid>
+      <w:tr>
+        <w:tc>
+          <w:tcPr>
+            <w:tcW w:type="dxa" w:w="900"/>
+            <w:tcBorders>
+              <w:top w:val="single" w:color="8A8A8A" w:sz="4"/>
+              <w:left w:val="single" w:color="8A8A8A" w:sz="4"/>
+              <w:bottom w:val="single" w:color="8A8A8A" w:sz="4"/>
+              <w:right w:val="single" w:color="8A8A8A" w:sz="4"/>
+            </w:tcBorders>
+            <w:shd w:fill="E3EEEC" w:color="auto" w:val="clear"/>
+            <w:tcMar>
+              <w:top w:type="dxa" w:w="50"/>
+              <w:left w:type="dxa" w:w="120"/>
+              <w:bottom w:type="dxa" w:w="50"/>
+              <w:right w:type="dxa" w:w="120"/>
+            </w:tcMar>
+          </w:tcPr>
+          <w:p>
+            <w:pPr>
+              <w:jc w:val="center"/>
+            </w:pPr>
+            <w:r>
+              <w:rPr>
+                <w:b/>
+                <w:bCs/>
+              </w:rPr>
+              <w:t xml:space="preserve">Sl. No.</w:t>
+            </w:r>
+          </w:p>
+        </w:tc>
+        <w:tc>
+          <w:tcPr>
+            <w:tcW w:type="dxa" w:w="3600"/>
+            <w:tcBorders>
+              <w:top w:val="single" w:color="8A8A8A" w:sz="4"/>
+              <w:left w:val="single" w:color="8A8A8A" w:sz="4"/>
+              <w:bottom w:val="single" w:color="8A8A8A" w:sz="4"/>
+              <w:right w:val="single" w:color="8A8A8A" w:sz="4"/>
+            </w:tcBorders>
+            <w:shd w:fill="E3EEEC" w:color="auto" w:val="clear"/>
+            <w:tcMar>
+              <w:top w:type="dxa" w:w="50"/>
+              <w:left w:type="dxa" w:w="120"/>
+              <w:bottom w:type="dxa" w:w="50"/>
+              <w:right w:type="dxa" w:w="120"/>
+            </w:tcMar>
+          </w:tcPr>
+          <w:p>
+            <w:pPr>
+              <w:jc w:val="center"/>
+            </w:pPr>
+            <w:r>
+              <w:rPr>
+                <w:b/>
+                <w:bCs/>
+              </w:rPr>
+              <w:t xml:space="preserve">Name</w:t>
+            </w:r>
+          </w:p>
+        </w:tc>
+        <w:tc>
+          <w:tcPr>
+            <w:tcW w:type="dxa" w:w="2800"/>
+            <w:tcBorders>
+              <w:top w:val="single" w:color="8A8A8A" w:sz="4"/>
+              <w:left w:val="single" w:color="8A8A8A" w:sz="4"/>
+              <w:bottom w:val="single" w:color="8A8A8A" w:sz="4"/>
+              <w:right w:val="single" w:color="8A8A8A" w:sz="4"/>
+            </w:tcBorders>
+            <w:shd w:fill="E3EEEC" w:color="auto" w:val="clear"/>
+            <w:tcMar>
+              <w:top w:type="dxa" w:w="50"/>
+              <w:left w:type="dxa" w:w="120"/>
+              <w:bottom w:type="dxa" w:w="50"/>
+              <w:right w:type="dxa" w:w="120"/>
+            </w:tcMar>
+          </w:tcPr>
+          <w:p>
+            <w:pPr>
+              <w:jc w:val="center"/>
+            </w:pPr>
+            <w:r>
+              <w:rPr>
+                <w:b/>
+                <w:bCs/>
+              </w:rPr>
+              <w:t xml:space="preserve">SIN</w:t>
+            </w:r>
+          </w:p>
+        </w:tc>
+      </w:tr>
+      <w:tr>
+        <w:tc>
+          <w:tcPr>
+            <w:tcW w:type="dxa" w:w="900"/>
+            <w:tcBorders>
+              <w:top w:val="single" w:color="8A8A8A" w:sz="4"/>
+              <w:left w:val="single" w:color="8A8A8A" w:sz="4"/>
+              <w:bottom w:val="single" w:color="8A8A8A" w:sz="4"/>
+              <w:right w:val="single" w:color="8A8A8A" w:sz="4"/>
+            </w:tcBorders>
+            <w:tcMar>
+              <w:top w:type="dxa" w:w="50"/>
+              <w:left w:type="dxa" w:w="120"/>
+              <w:bottom w:type="dxa" w:w="50"/>
+              <w:right w:type="dxa" w:w="120"/>
+            </w:tcMar>
+          </w:tcPr>
+          <w:p>
+            <w:pPr>
+              <w:jc w:val="center"/>
+            </w:pPr>
+            <w:r>
+              <w:rPr>
+                <w:b w:val="false"/>
+                <w:bCs w:val="false"/>
+              </w:rPr>
+              <w:t xml:space="preserve">1</w:t>
+            </w:r>
+          </w:p>
+        </w:tc>
+        <w:tc>
+          <w:tcPr>
+            <w:tcW w:type="dxa" w:w="3600"/>
+            <w:tcBorders>
+              <w:top w:val="single" w:color="8A8A8A" w:sz="4"/>
+              <w:left w:val="single" w:color="8A8A8A" w:sz="4"/>
+              <w:bottom w:val="single" w:color="8A8A8A" w:sz="4"/>
+              <w:right w:val="single" w:color="8A8A8A" w:sz="4"/>
+            </w:tcBorders>
+            <w:tcMar>
+              <w:top w:type="dxa" w:w="50"/>
+              <w:left w:type="dxa" w:w="120"/>
+              <w:bottom w:type="dxa" w:w="50"/>
+              <w:right w:type="dxa" w:w="120"/>
+            </w:tcMar>
+          </w:tcPr>
+          <w:p>
+            <w:pPr>
+              <w:jc w:val="center"/>
+            </w:pPr>
+            <w:r>
+              <w:rPr>
+                <w:b w:val="false"/>
+                <w:bCs w:val="false"/>
+              </w:rPr>
+              <w:t xml:space="preserve">Ishaan Seal</w:t>
+            </w:r>
+          </w:p>
+        </w:tc>
+        <w:tc>
+          <w:tcPr>
+            <w:tcW w:type="dxa" w:w="2800"/>
+            <w:tcBorders>
+              <w:top w:val="single" w:color="8A8A8A" w:sz="4"/>
+              <w:left w:val="single" w:color="8A8A8A" w:sz="4"/>
+              <w:bottom w:val="single" w:color="8A8A8A" w:sz="4"/>
+              <w:right w:val="single" w:color="8A8A8A" w:sz="4"/>
+            </w:tcBorders>
+            <w:tcMar>
+              <w:top w:type="dxa" w:w="50"/>
+              <w:left w:type="dxa" w:w="120"/>
+              <w:bottom w:type="dxa" w:w="50"/>
+              <w:right w:type="dxa" w:w="120"/>
+            </w:tcMar>
+          </w:tcPr>
+          <w:p>
+            <w:pPr>
+              <w:jc w:val="center"/>
+            </w:pPr>
+            <w:r>
+              <w:rPr>
+                <w:b w:val="false"/>
+                <w:bCs w:val="false"/>
+              </w:rPr>
+              <w:t xml:space="preserve">26-001-08-32-0059</w:t>
+            </w:r>
+          </w:p>
+        </w:tc>
+      </w:tr>
+      <w:tr>
+        <w:tc>
+          <w:tcPr>
+            <w:tcW w:type="dxa" w:w="900"/>
+            <w:tcBorders>
+              <w:top w:val="single" w:color="8A8A8A" w:sz="4"/>
+              <w:left w:val="single" w:color="8A8A8A" w:sz="4"/>
+              <w:bottom w:val="single" w:color="8A8A8A" w:sz="4"/>
+              <w:right w:val="single" w:color="8A8A8A" w:sz="4"/>
+            </w:tcBorders>
+            <w:tcMar>
+              <w:top w:type="dxa" w:w="50"/>
+              <w:left w:type="dxa" w:w="120"/>
+              <w:bottom w:type="dxa" w:w="50"/>
+              <w:right w:type="dxa" w:w="120"/>
+            </w:tcMar>
+          </w:tcPr>
+          <w:p>
+            <w:pPr>
+              <w:jc w:val="center"/>
+            </w:pPr>
+            <w:r>
+              <w:rPr>
+                <w:b w:val="false"/>
+                <w:bCs w:val="false"/>
+              </w:rPr>
+              <w:t xml:space="preserve">2</w:t>
+            </w:r>
+          </w:p>
+        </w:tc>
+        <w:tc>
+          <w:tcPr>
+            <w:tcW w:type="dxa" w:w="3600"/>
+            <w:tcBorders>
+              <w:top w:val="single" w:color="8A8A8A" w:sz="4"/>
+              <w:left w:val="single" w:color="8A8A8A" w:sz="4"/>
+              <w:bottom w:val="single" w:color="8A8A8A" w:sz="4"/>
+              <w:right w:val="single" w:color="8A8A8A" w:sz="4"/>
+            </w:tcBorders>
+            <w:tcMar>
+              <w:top w:type="dxa" w:w="50"/>
+              <w:left w:type="dxa" w:w="120"/>
+              <w:bottom w:type="dxa" w:w="50"/>
+              <w:right w:type="dxa" w:w="120"/>
+            </w:tcMar>
+          </w:tcPr>
+          <w:p>
+            <w:pPr>
+              <w:jc w:val="center"/>
+            </w:pPr>
+            <w:r>
+              <w:rPr>
+                <w:b w:val="false"/>
+                <w:bCs w:val="false"/>
+              </w:rPr>
+              <w:t xml:space="preserve">Debarjune Gangopadhyay</w:t>
+            </w:r>
+          </w:p>
+        </w:tc>
+        <w:tc>
+          <w:tcPr>
+            <w:tcW w:type="dxa" w:w="2800"/>
+            <w:tcBorders>
+              <w:top w:val="single" w:color="8A8A8A" w:sz="4"/>
+              <w:left w:val="single" w:color="8A8A8A" w:sz="4"/>
+              <w:bottom w:val="single" w:color="8A8A8A" w:sz="4"/>
+              <w:right w:val="single" w:color="8A8A8A" w:sz="4"/>
+            </w:tcBorders>
+            <w:tcMar>
+              <w:top w:type="dxa" w:w="50"/>
+              <w:left w:type="dxa" w:w="120"/>
+              <w:bottom w:type="dxa" w:w="50"/>
+              <w:right w:type="dxa" w:w="120"/>
+            </w:tcMar>
+          </w:tcPr>
+          <w:p>
+            <w:pPr>
+              <w:jc w:val="center"/>
+            </w:pPr>
+            <w:r>
+              <w:rPr>
+                <w:b w:val="false"/>
+                <w:bCs w:val="false"/>
+              </w:rPr>
+              <w:t xml:space="preserve">26-001-08-32-0071</w:t>
+            </w:r>
+          </w:p>
+        </w:tc>
+      </w:tr>
+      <w:tr>
+        <w:tc>
+          <w:tcPr>
+            <w:tcW w:type="dxa" w:w="900"/>
+            <w:tcBorders>
+              <w:top w:val="single" w:color="8A8A8A" w:sz="4"/>
+              <w:left w:val="single" w:color="8A8A8A" w:sz="4"/>
+              <w:bottom w:val="single" w:color="8A8A8A" w:sz="4"/>
+              <w:right w:val="single" w:color="8A8A8A" w:sz="4"/>
+            </w:tcBorders>
+            <w:tcMar>
+              <w:top w:type="dxa" w:w="50"/>
+              <w:left w:type="dxa" w:w="120"/>
+              <w:bottom w:type="dxa" w:w="50"/>
+              <w:right w:type="dxa" w:w="120"/>
+            </w:tcMar>
+          </w:tcPr>
+          <w:p>
+            <w:pPr>
+              <w:jc w:val="center"/>
+            </w:pPr>
+            <w:r>
+              <w:rPr>
+                <w:b w:val="false"/>
+                <w:bCs w:val="false"/>
+              </w:rPr>
+              <w:t xml:space="preserve">3</w:t>
+            </w:r>
+          </w:p>
+        </w:tc>
+        <w:tc>
+          <w:tcPr>
+            <w:tcW w:type="dxa" w:w="3600"/>
+            <w:tcBorders>
+              <w:top w:val="single" w:color="8A8A8A" w:sz="4"/>
+              <w:left w:val="single" w:color="8A8A8A" w:sz="4"/>
+              <w:bottom w:val="single" w:color="8A8A8A" w:sz="4"/>
+              <w:right w:val="single" w:color="8A8A8A" w:sz="4"/>
+            </w:tcBorders>
+            <w:tcMar>
+              <w:top w:type="dxa" w:w="50"/>
+              <w:left w:type="dxa" w:w="120"/>
+              <w:bottom w:type="dxa" w:w="50"/>
+              <w:right w:type="dxa" w:w="120"/>
+            </w:tcMar>
+          </w:tcPr>
+          <w:p>
+            <w:pPr>
+              <w:jc w:val="center"/>
+            </w:pPr>
+            <w:r>
+              <w:rPr>
+                <w:b w:val="false"/>
+                <w:bCs w:val="false"/>
+              </w:rPr>
+              <w:t xml:space="preserve">Saptajit Datta</w:t>
+            </w:r>
+          </w:p>
+        </w:tc>
+        <w:tc>
+          <w:tcPr>
+            <w:tcW w:type="dxa" w:w="2800"/>
+            <w:tcBorders>
+              <w:top w:val="single" w:color="8A8A8A" w:sz="4"/>
+              <w:left w:val="single" w:color="8A8A8A" w:sz="4"/>
+              <w:bottom w:val="single" w:color="8A8A8A" w:sz="4"/>
+              <w:right w:val="single" w:color="8A8A8A" w:sz="4"/>
+            </w:tcBorders>
+            <w:tcMar>
+              <w:top w:type="dxa" w:w="50"/>
+              <w:left w:type="dxa" w:w="120"/>
+              <w:bottom w:type="dxa" w:w="50"/>
+              <w:right w:type="dxa" w:w="120"/>
+            </w:tcMar>
+          </w:tcPr>
+          <w:p>
+            <w:pPr>
+              <w:jc w:val="center"/>
+            </w:pPr>
+            <w:r>
+              <w:rPr>
+                <w:b w:val="false"/>
+                <w:bCs w:val="false"/>
+              </w:rPr>
+              <w:t xml:space="preserve">26-001-08-32-0067</w:t>
+            </w:r>
+          </w:p>
+        </w:tc>
+      </w:tr>
+      <w:tr>
+        <w:tc>
+          <w:tcPr>
+            <w:tcW w:type="dxa" w:w="900"/>
+            <w:tcBorders>
+              <w:top w:val="single" w:color="8A8A8A" w:sz="4"/>
+              <w:left w:val="single" w:color="8A8A8A" w:sz="4"/>
+              <w:bottom w:val="single" w:color="8A8A8A" w:sz="4"/>
+              <w:right w:val="single" w:color="8A8A8A" w:sz="4"/>
+            </w:tcBorders>
+            <w:tcMar>
+              <w:top w:type="dxa" w:w="50"/>
+              <w:left w:type="dxa" w:w="120"/>
+              <w:bottom w:type="dxa" w:w="50"/>
+              <w:right w:type="dxa" w:w="120"/>
+            </w:tcMar>
+          </w:tcPr>
+          <w:p>
+            <w:pPr>
+              <w:jc w:val="center"/>
+            </w:pPr>
+            <w:r>
+              <w:rPr>
+                <w:b w:val="false"/>
+                <w:bCs w:val="false"/>
+              </w:rPr>
+              <w:t xml:space="preserve">4</w:t>
+            </w:r>
+          </w:p>
+        </w:tc>
+        <w:tc>
+          <w:tcPr>
+            <w:tcW w:type="dxa" w:w="3600"/>
+            <w:tcBorders>
+              <w:top w:val="single" w:color="8A8A8A" w:sz="4"/>
+              <w:left w:val="single" w:color="8A8A8A" w:sz="4"/>
+              <w:bottom w:val="single" w:color="8A8A8A" w:sz="4"/>
+              <w:right w:val="single" w:color="8A8A8A" w:sz="4"/>
+            </w:tcBorders>
+            <w:tcMar>
+              <w:top w:type="dxa" w:w="50"/>
+              <w:left w:type="dxa" w:w="120"/>
+              <w:bottom w:type="dxa" w:w="50"/>
+              <w:right w:type="dxa" w:w="120"/>
+            </w:tcMar>
+          </w:tcPr>
+          <w:p>
+            <w:pPr>
+              <w:jc w:val="center"/>
+            </w:pPr>
+            <w:r>
+              <w:rPr>
+                <w:b w:val="false"/>
+                <w:bCs w:val="false"/>
+              </w:rPr>
+              <w:t xml:space="preserve">Sadique Tanvee</w:t>
+            </w:r>
+          </w:p>
+        </w:tc>
+        <w:tc>
+          <w:tcPr>
+            <w:tcW w:type="dxa" w:w="2800"/>
+            <w:tcBorders>
+              <w:top w:val="single" w:color="8A8A8A" w:sz="4"/>
+              <w:left w:val="single" w:color="8A8A8A" w:sz="4"/>
+              <w:bottom w:val="single" w:color="8A8A8A" w:sz="4"/>
+              <w:right w:val="single" w:color="8A8A8A" w:sz="4"/>
+            </w:tcBorders>
+            <w:tcMar>
+              <w:top w:type="dxa" w:w="50"/>
+              <w:left w:type="dxa" w:w="120"/>
+              <w:bottom w:type="dxa" w:w="50"/>
+              <w:right w:type="dxa" w:w="120"/>
+            </w:tcMar>
+          </w:tcPr>
+          <w:p>
+            <w:pPr>
+              <w:jc w:val="center"/>
+            </w:pPr>
+            <w:r>
+              <w:rPr>
+                <w:b w:val="false"/>
+                <w:bCs w:val="false"/>
+              </w:rPr>
+              <w:t xml:space="preserve">26-001-08-32-0022</w:t>
+            </w:r>
+          </w:p>
+        </w:tc>
+      </w:tr>
+      <w:tr>
+        <w:tc>
+          <w:tcPr>
+            <w:tcW w:type="dxa" w:w="900"/>
+            <w:tcBorders>
+              <w:top w:val="single" w:color="8A8A8A" w:sz="4"/>
+              <w:left w:val="single" w:color="8A8A8A" w:sz="4"/>
+              <w:bottom w:val="single" w:color="8A8A8A" w:sz="4"/>
+              <w:right w:val="single" w:color="8A8A8A" w:sz="4"/>
+            </w:tcBorders>
+            <w:tcMar>
+              <w:top w:type="dxa" w:w="50"/>
+              <w:left w:type="dxa" w:w="120"/>
+              <w:bottom w:type="dxa" w:w="50"/>
+              <w:right w:type="dxa" w:w="120"/>
+            </w:tcMar>
+          </w:tcPr>
+          <w:p>
+            <w:pPr>
+              <w:jc w:val="center"/>
+            </w:pPr>
+            <w:r>
+              <w:rPr>
+                <w:b w:val="false"/>
+                <w:bCs w:val="false"/>
+              </w:rPr>
+              <w:t xml:space="preserve">5</w:t>
+            </w:r>
+          </w:p>
+        </w:tc>
+        <w:tc>
+          <w:tcPr>
+            <w:tcW w:type="dxa" w:w="3600"/>
+            <w:tcBorders>
+              <w:top w:val="single" w:color="8A8A8A" w:sz="4"/>
+              <w:left w:val="single" w:color="8A8A8A" w:sz="4"/>
+              <w:bottom w:val="single" w:color="8A8A8A" w:sz="4"/>
+              <w:right w:val="single" w:color="8A8A8A" w:sz="4"/>
+            </w:tcBorders>
+            <w:tcMar>
+              <w:top w:type="dxa" w:w="50"/>
+              <w:left w:type="dxa" w:w="120"/>
+              <w:bottom w:type="dxa" w:w="50"/>
+              <w:right w:type="dxa" w:w="120"/>
+            </w:tcMar>
+          </w:tcPr>
+          <w:p>
+            <w:pPr>
+              <w:jc w:val="center"/>
+            </w:pPr>
+            <w:r>
+              <w:rPr>
+                <w:b w:val="false"/>
+                <w:bCs w:val="false"/>
+              </w:rPr>
+              <w:t xml:space="preserve">Sarad Gupta</w:t>
+            </w:r>
+          </w:p>
+        </w:tc>
+        <w:tc>
+          <w:tcPr>
+            <w:tcW w:type="dxa" w:w="2800"/>
+            <w:tcBorders>
+              <w:top w:val="single" w:color="8A8A8A" w:sz="4"/>
+              <w:left w:val="single" w:color="8A8A8A" w:sz="4"/>
+              <w:bottom w:val="single" w:color="8A8A8A" w:sz="4"/>
+              <w:right w:val="single" w:color="8A8A8A" w:sz="4"/>
+            </w:tcBorders>
+            <w:tcMar>
+              <w:top w:type="dxa" w:w="50"/>
+              <w:left w:type="dxa" w:w="120"/>
+              <w:bottom w:type="dxa" w:w="50"/>
+              <w:right w:type="dxa" w:w="120"/>
+            </w:tcMar>
+          </w:tcPr>
+          <w:p>
+            <w:pPr>
+              <w:jc w:val="center"/>
+            </w:pPr>
+            <w:r>
+              <w:rPr>
+                <w:b w:val="false"/>
+                <w:bCs w:val="false"/>
+              </w:rPr>
+              <w:t xml:space="preserve">26-001-08-32-0073</w:t>
+            </w:r>
+          </w:p>
+        </w:tc>
+      </w:tr>
+      <w:tr>
+        <w:tc>
+          <w:tcPr>
+            <w:tcW w:type="dxa" w:w="900"/>
+            <w:tcBorders>
+              <w:top w:val="single" w:color="8A8A8A" w:sz="4"/>
+              <w:left w:val="single" w:color="8A8A8A" w:sz="4"/>
+              <w:bottom w:val="single" w:color="8A8A8A" w:sz="4"/>
+              <w:right w:val="single" w:color="8A8A8A" w:sz="4"/>
+            </w:tcBorders>
+            <w:tcMar>
+              <w:top w:type="dxa" w:w="50"/>
+              <w:left w:type="dxa" w:w="120"/>
+              <w:bottom w:type="dxa" w:w="50"/>
+              <w:right w:type="dxa" w:w="120"/>
+            </w:tcMar>
+          </w:tcPr>
+          <w:p>
+            <w:pPr>
+              <w:jc w:val="center"/>
+            </w:pPr>
+            <w:r>
+              <w:rPr>
+                <w:b w:val="false"/>
+                <w:bCs w:val="false"/>
+              </w:rPr>
+              <w:t xml:space="preserve">6</w:t>
+            </w:r>
+          </w:p>
+        </w:tc>
+        <w:tc>
+          <w:tcPr>
+            <w:tcW w:type="dxa" w:w="3600"/>
+            <w:tcBorders>
+              <w:top w:val="single" w:color="8A8A8A" w:sz="4"/>
+              <w:left w:val="single" w:color="8A8A8A" w:sz="4"/>
+              <w:bottom w:val="single" w:color="8A8A8A" w:sz="4"/>
+              <w:right w:val="single" w:color="8A8A8A" w:sz="4"/>
+            </w:tcBorders>
+            <w:tcMar>
+              <w:top w:type="dxa" w:w="50"/>
+              <w:left w:type="dxa" w:w="120"/>
+              <w:bottom w:type="dxa" w:w="50"/>
+              <w:right w:type="dxa" w:w="120"/>
+            </w:tcMar>
+          </w:tcPr>
+          <w:p>
+            <w:pPr>
+              <w:jc w:val="center"/>
+            </w:pPr>
+            <w:r>
+              <w:rPr>
+                <w:b w:val="false"/>
+                <w:bCs w:val="false"/>
+              </w:rPr>
+              <w:t xml:space="preserve">Saatvik Jaiswal</w:t>
+            </w:r>
+          </w:p>
+        </w:tc>
+        <w:tc>
+          <w:tcPr>
+            <w:tcW w:type="dxa" w:w="2800"/>
+            <w:tcBorders>
+              <w:top w:val="single" w:color="8A8A8A" w:sz="4"/>
+              <w:left w:val="single" w:color="8A8A8A" w:sz="4"/>
+              <w:bottom w:val="single" w:color="8A8A8A" w:sz="4"/>
+              <w:right w:val="single" w:color="8A8A8A" w:sz="4"/>
+            </w:tcBorders>
+            <w:tcMar>
+              <w:top w:type="dxa" w:w="50"/>
+              <w:left w:type="dxa" w:w="120"/>
+              <w:bottom w:type="dxa" w:w="50"/>
+              <w:right w:type="dxa" w:w="120"/>
+            </w:tcMar>
+          </w:tcPr>
+          <w:p>
+            <w:pPr>
+              <w:jc w:val="center"/>
+            </w:pPr>
+            <w:r>
+              <w:rPr>
+                <w:b w:val="false"/>
+                <w:bCs w:val="false"/>
+              </w:rPr>
+              <w:t xml:space="preserve">26-001-08-32-0054</w:t>
+            </w:r>
+          </w:p>
+        </w:tc>
+      </w:tr>
+      <w:tr>
+        <w:tc>
+          <w:tcPr>
+            <w:tcW w:type="dxa" w:w="900"/>
+            <w:tcBorders>
+              <w:top w:val="single" w:color="8A8A8A" w:sz="4"/>
+              <w:left w:val="single" w:color="8A8A8A" w:sz="4"/>
+              <w:bottom w:val="single" w:color="8A8A8A" w:sz="4"/>
+              <w:right w:val="single" w:color="8A8A8A" w:sz="4"/>
+            </w:tcBorders>
+            <w:tcMar>
+              <w:top w:type="dxa" w:w="50"/>
+              <w:left w:type="dxa" w:w="120"/>
+              <w:bottom w:type="dxa" w:w="50"/>
+              <w:right w:type="dxa" w:w="120"/>
+            </w:tcMar>
+          </w:tcPr>
+          <w:p>
+            <w:pPr>
+              <w:jc w:val="center"/>
+            </w:pPr>
+            <w:r>
+              <w:rPr>
+                <w:b w:val="false"/>
+                <w:bCs w:val="false"/>
+              </w:rPr>
+              <w:t xml:space="preserve">7</w:t>
+            </w:r>
+          </w:p>
+        </w:tc>
+        <w:tc>
+          <w:tcPr>
+            <w:tcW w:type="dxa" w:w="3600"/>
+            <w:tcBorders>
+              <w:top w:val="single" w:color="8A8A8A" w:sz="4"/>
+              <w:left w:val="single" w:color="8A8A8A" w:sz="4"/>
+              <w:bottom w:val="single" w:color="8A8A8A" w:sz="4"/>
+              <w:right w:val="single" w:color="8A8A8A" w:sz="4"/>
+            </w:tcBorders>
+            <w:tcMar>
+              <w:top w:type="dxa" w:w="50"/>
+              <w:left w:type="dxa" w:w="120"/>
+              <w:bottom w:type="dxa" w:w="50"/>
+              <w:right w:type="dxa" w:w="120"/>
+            </w:tcMar>
+          </w:tcPr>
+          <w:p>
+            <w:pPr>
+              <w:jc w:val="center"/>
+            </w:pPr>
+            <w:r>
+              <w:rPr>
+                <w:b w:val="false"/>
+                <w:bCs w:val="false"/>
+              </w:rPr>
+              <w:t xml:space="preserve">Nishan Bhattacharjee</w:t>
+            </w:r>
+          </w:p>
+        </w:tc>
+        <w:tc>
+          <w:tcPr>
+            <w:tcW w:type="dxa" w:w="2800"/>
+            <w:tcBorders>
+              <w:top w:val="single" w:color="8A8A8A" w:sz="4"/>
+              <w:left w:val="single" w:color="8A8A8A" w:sz="4"/>
+              <w:bottom w:val="single" w:color="8A8A8A" w:sz="4"/>
+              <w:right w:val="single" w:color="8A8A8A" w:sz="4"/>
+            </w:tcBorders>
+            <w:tcMar>
+              <w:top w:type="dxa" w:w="50"/>
+              <w:left w:type="dxa" w:w="120"/>
+              <w:bottom w:type="dxa" w:w="50"/>
+              <w:right w:type="dxa" w:w="120"/>
+            </w:tcMar>
+          </w:tcPr>
+          <w:p>
+            <w:pPr>
+              <w:jc w:val="center"/>
+            </w:pPr>
+            <w:r>
+              <w:rPr>
+                <w:b w:val="false"/>
+                <w:bCs w:val="false"/>
+              </w:rPr>
+              <w:t xml:space="preserve">26-001-08-32-0055</w:t>
+            </w:r>
+          </w:p>
+        </w:tc>
+      </w:tr>
+    </w:tbl>
+    <w:p>
+      <w:pPr>
+        <w:spacing w:after="400"/>
+      </w:pPr>
     </w:p>
     <w:p>
       <w:pPr>

</xml_diff>

<commit_message>
Reframe the design-thinking report and deck: clinics to health systems
The report and deck now follow the original plan — single-doctor clinics,
then multi-doctor clinics, hospitals and health systems, then
international — with no field-site town or rural starting point. The
report gains a second persona for a larger institution, a scaling-path
section, and prescription and receipt screenshots without the old
address.

Co-Authored-By: Claude Opus 5.5 <noreply@anthropic.com>
Claude-Session: https://claude.ai/code/session_012tam43Wrx3VFhnLz3rDLzg
</commit_message>
<xml_diff>
--- a/artifacts/ClinicOS_DesignThinking_Report.docx
+++ b/artifacts/ClinicOS_DesignThinking_Report.docx
@@ -35,7 +35,7 @@
           <w:i/>
           <w:iCs/>
         </w:rPr>
-        <w:t xml:space="preserve">A Design Thinking Report on a Consultation-Documentation Assistant for Single-Doctor Rural Clinics in India</w:t>
+        <w:t xml:space="preserve">A Design Thinking Report on a Consultation-Documentation Assistant for Clinics, Hospitals and Health Systems</w:t>
       </w:r>
     </w:p>
     <w:p>
@@ -893,7 +893,7 @@
         <w:tabs>
           <w:tab w:val="right" w:pos="9026" w:leader="dot"/>
         </w:tabs>
-        <w:spacing w:after="80" w:line="276"/>
+        <w:spacing w:after="40" w:line="264"/>
         <w:ind w:left="0"/>
       </w:pPr>
       <w:r>
@@ -917,7 +917,7 @@
         <w:tabs>
           <w:tab w:val="right" w:pos="9026" w:leader="dot"/>
         </w:tabs>
-        <w:spacing w:after="80" w:line="276"/>
+        <w:spacing w:after="40" w:line="264"/>
         <w:ind w:left="0"/>
       </w:pPr>
       <w:r>
@@ -941,7 +941,7 @@
         <w:tabs>
           <w:tab w:val="right" w:pos="9026" w:leader="dot"/>
         </w:tabs>
-        <w:spacing w:after="40" w:line="276"/>
+        <w:spacing w:after="20" w:line="264"/>
         <w:ind w:left="400"/>
       </w:pPr>
       <w:r>
@@ -949,7 +949,7 @@
           <w:b w:val="false"/>
           <w:bCs w:val="false"/>
         </w:rPr>
-        <w:t xml:space="preserve">1.1 The Setting: One Room, One Doctor, One Register</w:t>
+        <w:t xml:space="preserve">1.1 The Setting: The Outpatient Consultation</w:t>
       </w:r>
       <w:r>
         <w:rPr>
@@ -965,7 +965,7 @@
         <w:tabs>
           <w:tab w:val="right" w:pos="9026" w:leader="dot"/>
         </w:tabs>
-        <w:spacing w:after="40" w:line="276"/>
+        <w:spacing w:after="20" w:line="264"/>
         <w:ind w:left="400"/>
       </w:pPr>
       <w:r>
@@ -989,7 +989,7 @@
         <w:tabs>
           <w:tab w:val="right" w:pos="9026" w:leader="dot"/>
         </w:tabs>
-        <w:spacing w:after="40" w:line="276"/>
+        <w:spacing w:after="20" w:line="264"/>
         <w:ind w:left="400"/>
       </w:pPr>
       <w:r>
@@ -1013,7 +1013,7 @@
         <w:tabs>
           <w:tab w:val="right" w:pos="9026" w:leader="dot"/>
         </w:tabs>
-        <w:spacing w:after="40" w:line="276"/>
+        <w:spacing w:after="20" w:line="264"/>
         <w:ind w:left="400"/>
       </w:pPr>
       <w:r>
@@ -1037,7 +1037,7 @@
         <w:tabs>
           <w:tab w:val="right" w:pos="9026" w:leader="dot"/>
         </w:tabs>
-        <w:spacing w:after="40" w:line="276"/>
+        <w:spacing w:after="20" w:line="264"/>
         <w:ind w:left="400"/>
       </w:pPr>
       <w:r>
@@ -1061,7 +1061,7 @@
         <w:tabs>
           <w:tab w:val="right" w:pos="9026" w:leader="dot"/>
         </w:tabs>
-        <w:spacing w:after="40" w:line="276"/>
+        <w:spacing w:after="20" w:line="264"/>
         <w:ind w:left="400"/>
       </w:pPr>
       <w:r>
@@ -1069,7 +1069,7 @@
           <w:b w:val="false"/>
           <w:bCs w:val="false"/>
         </w:rPr>
-        <w:t xml:space="preserve">1.6 Who We Are Designing For: Persona</w:t>
+        <w:t xml:space="preserve">1.6 Who We Are Designing For: Personas</w:t>
       </w:r>
       <w:r>
         <w:rPr>
@@ -1085,7 +1085,7 @@
         <w:tabs>
           <w:tab w:val="right" w:pos="9026" w:leader="dot"/>
         </w:tabs>
-        <w:spacing w:after="40" w:line="276"/>
+        <w:spacing w:after="20" w:line="264"/>
         <w:ind w:left="400"/>
       </w:pPr>
       <w:r>
@@ -1101,7 +1101,7 @@
           <w:bCs w:val="false"/>
         </w:rPr>
         <w:tab/>
-        <w:t xml:space="preserve">6</w:t>
+        <w:t xml:space="preserve">7</w:t>
       </w:r>
     </w:p>
     <w:p>
@@ -1109,7 +1109,7 @@
         <w:tabs>
           <w:tab w:val="right" w:pos="9026" w:leader="dot"/>
         </w:tabs>
-        <w:spacing w:after="40" w:line="276"/>
+        <w:spacing w:after="20" w:line="264"/>
         <w:ind w:left="400"/>
       </w:pPr>
       <w:r>
@@ -1133,7 +1133,7 @@
         <w:tabs>
           <w:tab w:val="right" w:pos="9026" w:leader="dot"/>
         </w:tabs>
-        <w:spacing w:after="80" w:line="276"/>
+        <w:spacing w:after="40" w:line="264"/>
         <w:ind w:left="0"/>
       </w:pPr>
       <w:r>
@@ -1157,7 +1157,7 @@
         <w:tabs>
           <w:tab w:val="right" w:pos="9026" w:leader="dot"/>
         </w:tabs>
-        <w:spacing w:after="40" w:line="276"/>
+        <w:spacing w:after="20" w:line="264"/>
         <w:ind w:left="400"/>
       </w:pPr>
       <w:r>
@@ -1181,7 +1181,7 @@
         <w:tabs>
           <w:tab w:val="right" w:pos="9026" w:leader="dot"/>
         </w:tabs>
-        <w:spacing w:after="40" w:line="276"/>
+        <w:spacing w:after="20" w:line="264"/>
         <w:ind w:left="400"/>
       </w:pPr>
       <w:r>
@@ -1205,7 +1205,7 @@
         <w:tabs>
           <w:tab w:val="right" w:pos="9026" w:leader="dot"/>
         </w:tabs>
-        <w:spacing w:after="40" w:line="276"/>
+        <w:spacing w:after="20" w:line="264"/>
         <w:ind w:left="400"/>
       </w:pPr>
       <w:r>
@@ -1229,7 +1229,7 @@
         <w:tabs>
           <w:tab w:val="right" w:pos="9026" w:leader="dot"/>
         </w:tabs>
-        <w:spacing w:after="40" w:line="276"/>
+        <w:spacing w:after="20" w:line="264"/>
         <w:ind w:left="400"/>
       </w:pPr>
       <w:r>
@@ -1253,7 +1253,7 @@
         <w:tabs>
           <w:tab w:val="right" w:pos="9026" w:leader="dot"/>
         </w:tabs>
-        <w:spacing w:after="40" w:line="276"/>
+        <w:spacing w:after="20" w:line="264"/>
         <w:ind w:left="400"/>
       </w:pPr>
       <w:r>
@@ -1277,7 +1277,7 @@
         <w:tabs>
           <w:tab w:val="right" w:pos="9026" w:leader="dot"/>
         </w:tabs>
-        <w:spacing w:after="40" w:line="276"/>
+        <w:spacing w:after="20" w:line="264"/>
         <w:ind w:left="400"/>
       </w:pPr>
       <w:r>
@@ -1301,7 +1301,7 @@
         <w:tabs>
           <w:tab w:val="right" w:pos="9026" w:leader="dot"/>
         </w:tabs>
-        <w:spacing w:after="80" w:line="276"/>
+        <w:spacing w:after="40" w:line="264"/>
         <w:ind w:left="0"/>
       </w:pPr>
       <w:r>
@@ -1325,7 +1325,7 @@
         <w:tabs>
           <w:tab w:val="right" w:pos="9026" w:leader="dot"/>
         </w:tabs>
-        <w:spacing w:after="40" w:line="276"/>
+        <w:spacing w:after="20" w:line="264"/>
         <w:ind w:left="400"/>
       </w:pPr>
       <w:r>
@@ -1349,7 +1349,7 @@
         <w:tabs>
           <w:tab w:val="right" w:pos="9026" w:leader="dot"/>
         </w:tabs>
-        <w:spacing w:after="40" w:line="276"/>
+        <w:spacing w:after="20" w:line="264"/>
         <w:ind w:left="400"/>
       </w:pPr>
       <w:r>
@@ -1373,7 +1373,7 @@
         <w:tabs>
           <w:tab w:val="right" w:pos="9026" w:leader="dot"/>
         </w:tabs>
-        <w:spacing w:after="40" w:line="276"/>
+        <w:spacing w:after="20" w:line="264"/>
         <w:ind w:left="400"/>
       </w:pPr>
       <w:r>
@@ -1397,7 +1397,7 @@
         <w:tabs>
           <w:tab w:val="right" w:pos="9026" w:leader="dot"/>
         </w:tabs>
-        <w:spacing w:after="40" w:line="276"/>
+        <w:spacing w:after="20" w:line="264"/>
         <w:ind w:left="400"/>
       </w:pPr>
       <w:r>
@@ -1421,7 +1421,7 @@
         <w:tabs>
           <w:tab w:val="right" w:pos="9026" w:leader="dot"/>
         </w:tabs>
-        <w:spacing w:after="40" w:line="276"/>
+        <w:spacing w:after="20" w:line="264"/>
         <w:ind w:left="400"/>
       </w:pPr>
       <w:r>
@@ -1445,7 +1445,7 @@
         <w:tabs>
           <w:tab w:val="right" w:pos="9026" w:leader="dot"/>
         </w:tabs>
-        <w:spacing w:after="80" w:line="276"/>
+        <w:spacing w:after="40" w:line="264"/>
         <w:ind w:left="0"/>
       </w:pPr>
       <w:r>
@@ -1469,7 +1469,7 @@
         <w:tabs>
           <w:tab w:val="right" w:pos="9026" w:leader="dot"/>
         </w:tabs>
-        <w:spacing w:after="40" w:line="276"/>
+        <w:spacing w:after="20" w:line="264"/>
         <w:ind w:left="400"/>
       </w:pPr>
       <w:r>
@@ -1493,7 +1493,7 @@
         <w:tabs>
           <w:tab w:val="right" w:pos="9026" w:leader="dot"/>
         </w:tabs>
-        <w:spacing w:after="40" w:line="276"/>
+        <w:spacing w:after="20" w:line="264"/>
         <w:ind w:left="400"/>
       </w:pPr>
       <w:r>
@@ -1517,7 +1517,7 @@
         <w:tabs>
           <w:tab w:val="right" w:pos="9026" w:leader="dot"/>
         </w:tabs>
-        <w:spacing w:after="40" w:line="276"/>
+        <w:spacing w:after="20" w:line="264"/>
         <w:ind w:left="400"/>
       </w:pPr>
       <w:r>
@@ -1541,7 +1541,7 @@
         <w:tabs>
           <w:tab w:val="right" w:pos="9026" w:leader="dot"/>
         </w:tabs>
-        <w:spacing w:after="40" w:line="276"/>
+        <w:spacing w:after="20" w:line="264"/>
         <w:ind w:left="400"/>
       </w:pPr>
       <w:r>
@@ -1565,7 +1565,7 @@
         <w:tabs>
           <w:tab w:val="right" w:pos="9026" w:leader="dot"/>
         </w:tabs>
-        <w:spacing w:after="40" w:line="276"/>
+        <w:spacing w:after="20" w:line="264"/>
         <w:ind w:left="400"/>
       </w:pPr>
       <w:r>
@@ -1589,7 +1589,7 @@
         <w:tabs>
           <w:tab w:val="right" w:pos="9026" w:leader="dot"/>
         </w:tabs>
-        <w:spacing w:after="80" w:line="276"/>
+        <w:spacing w:after="40" w:line="264"/>
         <w:ind w:left="0"/>
       </w:pPr>
       <w:r>
@@ -1613,7 +1613,7 @@
         <w:tabs>
           <w:tab w:val="right" w:pos="9026" w:leader="dot"/>
         </w:tabs>
-        <w:spacing w:after="40" w:line="276"/>
+        <w:spacing w:after="20" w:line="264"/>
         <w:ind w:left="400"/>
       </w:pPr>
       <w:r>
@@ -1637,7 +1637,7 @@
         <w:tabs>
           <w:tab w:val="right" w:pos="9026" w:leader="dot"/>
         </w:tabs>
-        <w:spacing w:after="40" w:line="276"/>
+        <w:spacing w:after="20" w:line="264"/>
         <w:ind w:left="400"/>
       </w:pPr>
       <w:r>
@@ -1661,7 +1661,7 @@
         <w:tabs>
           <w:tab w:val="right" w:pos="9026" w:leader="dot"/>
         </w:tabs>
-        <w:spacing w:after="40" w:line="276"/>
+        <w:spacing w:after="20" w:line="264"/>
         <w:ind w:left="400"/>
       </w:pPr>
       <w:r>
@@ -1685,7 +1685,7 @@
         <w:tabs>
           <w:tab w:val="right" w:pos="9026" w:leader="dot"/>
         </w:tabs>
-        <w:spacing w:after="40" w:line="276"/>
+        <w:spacing w:after="20" w:line="264"/>
         <w:ind w:left="400"/>
       </w:pPr>
       <w:r>
@@ -1693,7 +1693,7 @@
           <w:b w:val="false"/>
           <w:bCs w:val="false"/>
         </w:rPr>
-        <w:t xml:space="preserve">5.4 Next Steps</w:t>
+        <w:t xml:space="preserve">5.4 The Scaling Path</w:t>
       </w:r>
       <w:r>
         <w:rPr>
@@ -1709,20 +1709,20 @@
         <w:tabs>
           <w:tab w:val="right" w:pos="9026" w:leader="dot"/>
         </w:tabs>
-        <w:spacing w:after="80" w:line="276"/>
-        <w:ind w:left="0"/>
-      </w:pPr>
-      <w:r>
-        <w:rPr>
-          <w:b/>
-          <w:bCs/>
-        </w:rPr>
-        <w:t xml:space="preserve">6. PROTOTYPE SCREENSHOTS</w:t>
-      </w:r>
-      <w:r>
-        <w:rPr>
-          <w:b/>
-          <w:bCs/>
+        <w:spacing w:after="20" w:line="264"/>
+        <w:ind w:left="400"/>
+      </w:pPr>
+      <w:r>
+        <w:rPr>
+          <w:b w:val="false"/>
+          <w:bCs w:val="false"/>
+        </w:rPr>
+        <w:t xml:space="preserve">5.5 Next Steps</w:t>
+      </w:r>
+      <w:r>
+        <w:rPr>
+          <w:b w:val="false"/>
+          <w:bCs w:val="false"/>
         </w:rPr>
         <w:tab/>
         <w:t xml:space="preserve">18</w:t>
@@ -1733,23 +1733,23 @@
         <w:tabs>
           <w:tab w:val="right" w:pos="9026" w:leader="dot"/>
         </w:tabs>
-        <w:spacing w:after="40" w:line="276"/>
-        <w:ind w:left="400"/>
-      </w:pPr>
-      <w:r>
-        <w:rPr>
-          <w:b w:val="false"/>
-          <w:bCs w:val="false"/>
-        </w:rPr>
-        <w:t xml:space="preserve">6.1 Getting In</w:t>
-      </w:r>
-      <w:r>
-        <w:rPr>
-          <w:b w:val="false"/>
-          <w:bCs w:val="false"/>
+        <w:spacing w:after="40" w:line="264"/>
+        <w:ind w:left="0"/>
+      </w:pPr>
+      <w:r>
+        <w:rPr>
+          <w:b/>
+          <w:bCs/>
+        </w:rPr>
+        <w:t xml:space="preserve">6. PROTOTYPE SCREENSHOTS</w:t>
+      </w:r>
+      <w:r>
+        <w:rPr>
+          <w:b/>
+          <w:bCs/>
         </w:rPr>
         <w:tab/>
-        <w:t xml:space="preserve">18</w:t>
+        <w:t xml:space="preserve">19</w:t>
       </w:r>
     </w:p>
     <w:p>
@@ -1757,7 +1757,7 @@
         <w:tabs>
           <w:tab w:val="right" w:pos="9026" w:leader="dot"/>
         </w:tabs>
-        <w:spacing w:after="40" w:line="276"/>
+        <w:spacing w:after="20" w:line="264"/>
         <w:ind w:left="400"/>
       </w:pPr>
       <w:r>
@@ -1765,7 +1765,7 @@
           <w:b w:val="false"/>
           <w:bCs w:val="false"/>
         </w:rPr>
-        <w:t xml:space="preserve">6.2 The Doctor's Consultation</w:t>
+        <w:t xml:space="preserve">6.1 Getting In</w:t>
       </w:r>
       <w:r>
         <w:rPr>
@@ -1781,7 +1781,7 @@
         <w:tabs>
           <w:tab w:val="right" w:pos="9026" w:leader="dot"/>
         </w:tabs>
-        <w:spacing w:after="40" w:line="276"/>
+        <w:spacing w:after="20" w:line="264"/>
         <w:ind w:left="400"/>
       </w:pPr>
       <w:r>
@@ -1789,7 +1789,7 @@
           <w:b w:val="false"/>
           <w:bCs w:val="false"/>
         </w:rPr>
-        <w:t xml:space="preserve">6.3 The Front Desk</w:t>
+        <w:t xml:space="preserve">6.2 The Doctor's Consultation</w:t>
       </w:r>
       <w:r>
         <w:rPr>
@@ -1797,7 +1797,7 @@
           <w:bCs w:val="false"/>
         </w:rPr>
         <w:tab/>
-        <w:t xml:space="preserve">25</w:t>
+        <w:t xml:space="preserve">20</w:t>
       </w:r>
     </w:p>
     <w:p>
@@ -1805,7 +1805,7 @@
         <w:tabs>
           <w:tab w:val="right" w:pos="9026" w:leader="dot"/>
         </w:tabs>
-        <w:spacing w:after="40" w:line="276"/>
+        <w:spacing w:after="20" w:line="264"/>
         <w:ind w:left="400"/>
       </w:pPr>
       <w:r>
@@ -1813,7 +1813,7 @@
           <w:b w:val="false"/>
           <w:bCs w:val="false"/>
         </w:rPr>
-        <w:t xml:space="preserve">6.4 Clinic Admin</w:t>
+        <w:t xml:space="preserve">6.3 The Front Desk</w:t>
       </w:r>
       <w:r>
         <w:rPr>
@@ -1821,7 +1821,7 @@
           <w:bCs w:val="false"/>
         </w:rPr>
         <w:tab/>
-        <w:t xml:space="preserve">27</w:t>
+        <w:t xml:space="preserve">26</w:t>
       </w:r>
     </w:p>
     <w:p>
@@ -1829,23 +1829,23 @@
         <w:tabs>
           <w:tab w:val="right" w:pos="9026" w:leader="dot"/>
         </w:tabs>
-        <w:spacing w:after="80" w:line="276"/>
-        <w:ind w:left="0"/>
-      </w:pPr>
-      <w:r>
-        <w:rPr>
-          <w:b/>
-          <w:bCs/>
-        </w:rPr>
-        <w:t xml:space="preserve">7. CONCLUSION AND LEARNINGS</w:t>
-      </w:r>
-      <w:r>
-        <w:rPr>
-          <w:b/>
-          <w:bCs/>
+        <w:spacing w:after="20" w:line="264"/>
+        <w:ind w:left="400"/>
+      </w:pPr>
+      <w:r>
+        <w:rPr>
+          <w:b w:val="false"/>
+          <w:bCs w:val="false"/>
+        </w:rPr>
+        <w:t xml:space="preserve">6.4 Clinic Admin</w:t>
+      </w:r>
+      <w:r>
+        <w:rPr>
+          <w:b w:val="false"/>
+          <w:bCs w:val="false"/>
         </w:rPr>
         <w:tab/>
-        <w:t xml:space="preserve">29</w:t>
+        <w:t xml:space="preserve">28</w:t>
       </w:r>
     </w:p>
     <w:p>
@@ -1853,7 +1853,7 @@
         <w:tabs>
           <w:tab w:val="right" w:pos="9026" w:leader="dot"/>
         </w:tabs>
-        <w:spacing w:after="80" w:line="276"/>
+        <w:spacing w:after="40" w:line="264"/>
         <w:ind w:left="0"/>
       </w:pPr>
       <w:r>
@@ -1861,7 +1861,7 @@
           <w:b/>
           <w:bCs/>
         </w:rPr>
-        <w:t xml:space="preserve">8. REFERENCES</w:t>
+        <w:t xml:space="preserve">7. CONCLUSION AND LEARNINGS</w:t>
       </w:r>
       <w:r>
         <w:rPr>
@@ -1870,6 +1870,30 @@
         </w:rPr>
         <w:tab/>
         <w:t xml:space="preserve">30</w:t>
+      </w:r>
+    </w:p>
+    <w:p>
+      <w:pPr>
+        <w:tabs>
+          <w:tab w:val="right" w:pos="9026" w:leader="dot"/>
+        </w:tabs>
+        <w:spacing w:after="40" w:line="264"/>
+        <w:ind w:left="0"/>
+      </w:pPr>
+      <w:r>
+        <w:rPr>
+          <w:b/>
+          <w:bCs/>
+        </w:rPr>
+        <w:t xml:space="preserve">8. REFERENCES</w:t>
+      </w:r>
+      <w:r>
+        <w:rPr>
+          <w:b/>
+          <w:bCs/>
+        </w:rPr>
+        <w:tab/>
+        <w:t xml:space="preserve">31</w:t>
       </w:r>
     </w:p>
     <w:p>
@@ -1888,7 +1912,7 @@
         <w:jc w:val="both"/>
       </w:pPr>
       <w:r>
-        <w:t xml:space="preserve">ClinicOS is a consultation-documentation assistant built for single-doctor clinics in rural India, with its field site in Krishnanagar, Nadia district, West Bengal. In such a clinic the doctor has roughly two minutes for each patient, and in that time must greet, take a history, examine, explain, prescribe and record. The record is the part that gets dropped.</w:t>
+        <w:t xml:space="preserve">ClinicOS is a consultation-documentation assistant for clinics and medical institutions of every size. The plan from the start has been one product that grows with the institution using it: single-doctor and small clinics first, then multi-doctor clinics, hospitals and health systems, and finally an internationally scalable product. In a busy outpatient consultation the doctor has a few minutes for each patient — roughly two in India — and in that time must greet, take a history, examine, explain, prescribe and record. The record is the part that gets dropped.</w:t>
       </w:r>
     </w:p>
     <w:p>
@@ -2526,7 +2550,7 @@
         <w:keepNext/>
       </w:pPr>
       <w:r>
-        <w:t xml:space="preserve">1.1 The Setting: One Room, One Doctor, One Register</w:t>
+        <w:t xml:space="preserve">1.1 The Setting: The Outpatient Consultation</w:t>
       </w:r>
     </w:p>
     <w:p>
@@ -2535,7 +2559,7 @@
         <w:jc w:val="both"/>
       </w:pPr>
       <w:r>
-        <w:t xml:space="preserve">India's rural primary care runs on very small units. As of 31 March 2023 the country had 31,882 Primary Health Centres staffed by 40,583 doctors — roughly </w:t>
+        <w:t xml:space="preserve">Outpatient care everywhere runs under time pressure, and in India it is extreme. As of 31 March 2023 the public network alone had 31,882 Primary Health Centres staffed by 40,583 doctors — roughly </w:t>
       </w:r>
       <w:r>
         <w:rPr>
@@ -2545,7 +2569,7 @@
         <w:t xml:space="preserve">1.3 doctors per centre</w:t>
       </w:r>
       <w:r>
-        <w:t xml:space="preserve"> (Health Dynamics of India 2022–23, Ministry of Health and Family Welfare). Alongside this public network sits a much larger and largely uncounted layer of private single-doctor chambers: one room, one doctor, a paper register and a queue outside.</w:t>
+        <w:t xml:space="preserve"> (Health Dynamics of India 2022–23, Ministry of Health and Family Welfare) — and far more patients are seen in private practice: solo chambers, multi-doctor clinics and the outpatient departments of hospitals.</w:t>
       </w:r>
     </w:p>
     <w:p>
@@ -2554,7 +2578,17 @@
         <w:jc w:val="both"/>
       </w:pPr>
       <w:r>
-        <w:t xml:space="preserve">That chamber is the unit this project studies. It is where the largest number of Indian patients are seen, and almost no clinical software is designed for it. In a single-doctor clinic the doctor is at once the receptionist, the diagnostician, the writer of instructions for the pharmacist and the record-keeper.</w:t>
+        <w:t xml:space="preserve">The unit this project studies is the </w:t>
+      </w:r>
+      <w:r>
+        <w:rPr>
+          <w:b/>
+          <w:bCs/>
+        </w:rPr>
+        <w:t xml:space="preserve">outpatient consultation itself</w:t>
+      </w:r>
+      <w:r>
+        <w:t xml:space="preserve">, wherever it happens. It starts with the single-doctor clinic, where the doctor is at once the receptionist, the diagnostician, the writer of instructions for the pharmacist and the record-keeper, so the problem is easiest to see. The same consultation repeats — at larger scale, with more people and systems around it — in multi-doctor clinics, hospital outpatient departments and health systems, and in other countries. ClinicOS is designed to grow into each of them.</w:t>
       </w:r>
     </w:p>
     <w:p>
@@ -2593,7 +2627,7 @@
         <w:t xml:space="preserve">Secondary research.</w:t>
       </w:r>
       <w:r>
-        <w:t xml:space="preserve"> Published studies on consultation length, physician time use and rural internet access, used to understand the shape of the problem before going into the field.</w:t>
+        <w:t xml:space="preserve"> Published studies on consultation length, physician time use and internet access, used to understand the shape of the problem before going into the field.</w:t>
       </w:r>
     </w:p>
     <w:p>
@@ -2681,7 +2715,7 @@
         <w:t xml:space="preserve">Honest status of this stage.</w:t>
       </w:r>
       <w:r>
-        <w:t xml:space="preserve"> At the time of writing the secondary research is complete and the interview script is ready, but the twenty discovery interviews and the observation sessions have not yet been carried out. They are the first task of the next phase (Section 5.4). Every finding in Section 1.3 is therefore from published evidence and is labelled with its source; the persona and empathy map in Sections 1.6 and 1.7 are hypotheses to be checked against the interviews, not interview results.</w:t>
+        <w:t xml:space="preserve"> At the time of writing the secondary research is complete and the interview script is ready, but the twenty discovery interviews and the observation sessions have not yet been carried out. They are the first task of the next phase (Section 5.5). Every finding in Section 1.3 is therefore from published evidence and is labelled with its source; the persona and empathy map in Sections 1.6 and 1.7 are hypotheses to be checked against the interviews, not interview results.</w:t>
       </w:r>
     </w:p>
     <w:p>
@@ -3204,7 +3238,7 @@
               <w:spacing w:after="0" w:line="264"/>
             </w:pPr>
             <w:r>
-              <w:t xml:space="preserve">Rural households with internet access</w:t>
+              <w:t xml:space="preserve">Households with internet access in India</w:t>
             </w:r>
           </w:p>
         </w:tc>
@@ -3232,7 +3266,7 @@
               <w:spacing w:after="0" w:line="264"/>
             </w:pPr>
             <w:r>
-              <w:t xml:space="preserve">83.3% (urban 91.6%)</w:t>
+              <w:t xml:space="preserve">a large majority</w:t>
             </w:r>
           </w:p>
         </w:tc>
@@ -3551,7 +3585,7 @@
               <w:spacing w:after="0" w:line="264"/>
             </w:pPr>
             <w:r>
-              <w:t xml:space="preserve">Rural clinics are offline; connectivity is the binding constraint.</w:t>
+              <w:t xml:space="preserve">Clinics are offline; connectivity is the binding constraint.</w:t>
             </w:r>
           </w:p>
         </w:tc>
@@ -3579,7 +3613,7 @@
               <w:spacing w:after="0" w:line="264"/>
             </w:pPr>
             <w:r>
-              <w:t xml:space="preserve">83.3% of rural households have internet access, against 91.6% urban — a real gap, but far smaller than we assumed.</w:t>
+              <w:t xml:space="preserve">Internet access now reaches a large majority of Indian households — the gap is far smaller than we assumed.</w:t>
             </w:r>
           </w:p>
         </w:tc>
@@ -3714,7 +3748,7 @@
         <w:keepNext/>
       </w:pPr>
       <w:r>
-        <w:t xml:space="preserve">1.6 Who We Are Designing For: Persona</w:t>
+        <w:t xml:space="preserve">1.6 Who We Are Designing For: Personas</w:t>
       </w:r>
     </w:p>
     <w:p>
@@ -3723,7 +3757,7 @@
         <w:jc w:val="both"/>
       </w:pPr>
       <w:r>
-        <w:t xml:space="preserve">The persona below is a composite built from the published evidence and the field setting. Dr. Roy is not a real individual; the interviews will confirm or correct him.</w:t>
+        <w:t xml:space="preserve">The persona below is a composite built from the published evidence. Dr. Roy is not a real individual; the interviews will confirm or correct him.</w:t>
       </w:r>
     </w:p>
     <w:tbl>
@@ -3809,7 +3843,7 @@
                 <w:b/>
                 <w:bCs/>
               </w:rPr>
-              <w:t xml:space="preserve">Dr. A. Roy, 46 — solo practitioner, rural West Bengal</w:t>
+              <w:t xml:space="preserve">Dr. A. Roy, 46 — practitioner running his own clinic</w:t>
             </w:r>
           </w:p>
         </w:tc>
@@ -4120,6 +4154,357 @@
             </w:pPr>
             <w:r>
               <w:t xml:space="preserve">Anything that adds a step in front of a waiting patient, or that loses a consultation even once</w:t>
+            </w:r>
+          </w:p>
+        </w:tc>
+      </w:tr>
+    </w:tbl>
+    <w:p>
+      <w:pPr>
+        <w:spacing w:after="120"/>
+      </w:pPr>
+    </w:p>
+    <w:p>
+      <w:pPr>
+        <w:spacing w:after="140" w:before="0" w:line="300"/>
+        <w:jc w:val="both"/>
+      </w:pPr>
+      <w:r>
+        <w:t xml:space="preserve">Because ClinicOS is meant to grow beyond the single clinic, we also sketched the person who decides for a larger institution:</w:t>
+      </w:r>
+    </w:p>
+    <w:tbl>
+      <w:tblPr>
+        <w:tblW w:type="dxa" w:w="9026"/>
+        <w:tblBorders>
+          <w:top w:val="single" w:color="auto" w:sz="4"/>
+          <w:left w:val="single" w:color="auto" w:sz="4"/>
+          <w:bottom w:val="single" w:color="auto" w:sz="4"/>
+          <w:right w:val="single" w:color="auto" w:sz="4"/>
+          <w:insideH w:val="single" w:color="auto" w:sz="4"/>
+          <w:insideV w:val="single" w:color="auto" w:sz="4"/>
+        </w:tblBorders>
+      </w:tblPr>
+      <w:tblGrid>
+        <w:gridCol w:w="2600"/>
+        <w:gridCol w:w="6426"/>
+      </w:tblGrid>
+      <w:tr>
+        <w:trPr>
+          <w:cantSplit/>
+          <w:tblHeader/>
+        </w:trPr>
+        <w:tc>
+          <w:tcPr>
+            <w:tcW w:type="dxa" w:w="2600"/>
+            <w:tcBorders>
+              <w:top w:val="single" w:color="8A8A8A" w:sz="4"/>
+              <w:left w:val="single" w:color="8A8A8A" w:sz="4"/>
+              <w:bottom w:val="single" w:color="8A8A8A" w:sz="4"/>
+              <w:right w:val="single" w:color="8A8A8A" w:sz="4"/>
+            </w:tcBorders>
+            <w:shd w:fill="E3EEEC" w:color="auto" w:val="clear"/>
+            <w:tcMar>
+              <w:top w:type="dxa" w:w="60"/>
+              <w:left w:type="dxa" w:w="100"/>
+              <w:bottom w:type="dxa" w:w="60"/>
+              <w:right w:type="dxa" w:w="100"/>
+            </w:tcMar>
+            <w:vAlign w:val="top"/>
+          </w:tcPr>
+          <w:p>
+            <w:pPr>
+              <w:keepNext/>
+              <w:keepLines/>
+              <w:spacing w:after="0" w:line="264"/>
+            </w:pPr>
+            <w:r>
+              <w:rPr>
+                <w:b/>
+                <w:bCs/>
+              </w:rPr>
+              <w:t xml:space="preserve">Persona</w:t>
+            </w:r>
+          </w:p>
+        </w:tc>
+        <w:tc>
+          <w:tcPr>
+            <w:tcW w:type="dxa" w:w="6426"/>
+            <w:tcBorders>
+              <w:top w:val="single" w:color="8A8A8A" w:sz="4"/>
+              <w:left w:val="single" w:color="8A8A8A" w:sz="4"/>
+              <w:bottom w:val="single" w:color="8A8A8A" w:sz="4"/>
+              <w:right w:val="single" w:color="8A8A8A" w:sz="4"/>
+            </w:tcBorders>
+            <w:shd w:fill="E3EEEC" w:color="auto" w:val="clear"/>
+            <w:tcMar>
+              <w:top w:type="dxa" w:w="60"/>
+              <w:left w:type="dxa" w:w="100"/>
+              <w:bottom w:type="dxa" w:w="60"/>
+              <w:right w:type="dxa" w:w="100"/>
+            </w:tcMar>
+            <w:vAlign w:val="top"/>
+          </w:tcPr>
+          <w:p>
+            <w:pPr>
+              <w:keepNext/>
+              <w:keepLines/>
+              <w:spacing w:after="0" w:line="264"/>
+            </w:pPr>
+            <w:r>
+              <w:rPr>
+                <w:b/>
+                <w:bCs/>
+              </w:rPr>
+              <w:t xml:space="preserve">Ms. S. Banerjee, 41 — outpatient operations head at a multi-specialty hospital</w:t>
+            </w:r>
+          </w:p>
+        </w:tc>
+      </w:tr>
+      <w:tr>
+        <w:trPr>
+          <w:cantSplit/>
+          <w:tblHeader w:val="false"/>
+        </w:trPr>
+        <w:tc>
+          <w:tcPr>
+            <w:tcW w:type="dxa" w:w="2600"/>
+            <w:tcBorders>
+              <w:top w:val="single" w:color="8A8A8A" w:sz="4"/>
+              <w:left w:val="single" w:color="8A8A8A" w:sz="4"/>
+              <w:bottom w:val="single" w:color="8A8A8A" w:sz="4"/>
+              <w:right w:val="single" w:color="8A8A8A" w:sz="4"/>
+            </w:tcBorders>
+            <w:tcMar>
+              <w:top w:type="dxa" w:w="60"/>
+              <w:left w:type="dxa" w:w="100"/>
+              <w:bottom w:type="dxa" w:w="60"/>
+              <w:right w:type="dxa" w:w="100"/>
+            </w:tcMar>
+            <w:vAlign w:val="top"/>
+          </w:tcPr>
+          <w:p>
+            <w:pPr>
+              <w:keepNext/>
+              <w:keepLines/>
+              <w:spacing w:after="0" w:line="264"/>
+            </w:pPr>
+            <w:r>
+              <w:t xml:space="preserve">Practice</w:t>
+            </w:r>
+          </w:p>
+        </w:tc>
+        <w:tc>
+          <w:tcPr>
+            <w:tcW w:type="dxa" w:w="6426"/>
+            <w:tcBorders>
+              <w:top w:val="single" w:color="8A8A8A" w:sz="4"/>
+              <w:left w:val="single" w:color="8A8A8A" w:sz="4"/>
+              <w:bottom w:val="single" w:color="8A8A8A" w:sz="4"/>
+              <w:right w:val="single" w:color="8A8A8A" w:sz="4"/>
+            </w:tcBorders>
+            <w:tcMar>
+              <w:top w:type="dxa" w:w="60"/>
+              <w:left w:type="dxa" w:w="100"/>
+              <w:bottom w:type="dxa" w:w="60"/>
+              <w:right w:type="dxa" w:w="100"/>
+            </w:tcMar>
+            <w:vAlign w:val="top"/>
+          </w:tcPr>
+          <w:p>
+            <w:pPr>
+              <w:keepNext/>
+              <w:keepLines/>
+              <w:spacing w:after="0" w:line="264"/>
+            </w:pPr>
+            <w:r>
+              <w:t xml:space="preserve">Several doctors per shift, a front desk, billing staff and an IT team; hundreds of outpatient visits a day</w:t>
+            </w:r>
+          </w:p>
+        </w:tc>
+      </w:tr>
+      <w:tr>
+        <w:trPr>
+          <w:cantSplit/>
+          <w:tblHeader w:val="false"/>
+        </w:trPr>
+        <w:tc>
+          <w:tcPr>
+            <w:tcW w:type="dxa" w:w="2600"/>
+            <w:tcBorders>
+              <w:top w:val="single" w:color="8A8A8A" w:sz="4"/>
+              <w:left w:val="single" w:color="8A8A8A" w:sz="4"/>
+              <w:bottom w:val="single" w:color="8A8A8A" w:sz="4"/>
+              <w:right w:val="single" w:color="8A8A8A" w:sz="4"/>
+            </w:tcBorders>
+            <w:tcMar>
+              <w:top w:type="dxa" w:w="60"/>
+              <w:left w:type="dxa" w:w="100"/>
+              <w:bottom w:type="dxa" w:w="60"/>
+              <w:right w:type="dxa" w:w="100"/>
+            </w:tcMar>
+            <w:vAlign w:val="top"/>
+          </w:tcPr>
+          <w:p>
+            <w:pPr>
+              <w:keepNext/>
+              <w:keepLines/>
+              <w:spacing w:after="0" w:line="264"/>
+            </w:pPr>
+            <w:r>
+              <w:t xml:space="preserve">What she needs</w:t>
+            </w:r>
+          </w:p>
+        </w:tc>
+        <w:tc>
+          <w:tcPr>
+            <w:tcW w:type="dxa" w:w="6426"/>
+            <w:tcBorders>
+              <w:top w:val="single" w:color="8A8A8A" w:sz="4"/>
+              <w:left w:val="single" w:color="8A8A8A" w:sz="4"/>
+              <w:bottom w:val="single" w:color="8A8A8A" w:sz="4"/>
+              <w:right w:val="single" w:color="8A8A8A" w:sz="4"/>
+            </w:tcBorders>
+            <w:tcMar>
+              <w:top w:type="dxa" w:w="60"/>
+              <w:left w:type="dxa" w:w="100"/>
+              <w:bottom w:type="dxa" w:w="60"/>
+              <w:right w:type="dxa" w:w="100"/>
+            </w:tcMar>
+            <w:vAlign w:val="top"/>
+          </w:tcPr>
+          <w:p>
+            <w:pPr>
+              <w:keepNext/>
+              <w:keepLines/>
+              <w:spacing w:after="0" w:line="264"/>
+            </w:pPr>
+            <w:r>
+              <w:t xml:space="preserve">Complete, consistent consultation records across doctors, with clear roles and an audit trail</w:t>
+            </w:r>
+          </w:p>
+        </w:tc>
+      </w:tr>
+      <w:tr>
+        <w:trPr>
+          <w:cantSplit/>
+          <w:tblHeader w:val="false"/>
+        </w:trPr>
+        <w:tc>
+          <w:tcPr>
+            <w:tcW w:type="dxa" w:w="2600"/>
+            <w:tcBorders>
+              <w:top w:val="single" w:color="8A8A8A" w:sz="4"/>
+              <w:left w:val="single" w:color="8A8A8A" w:sz="4"/>
+              <w:bottom w:val="single" w:color="8A8A8A" w:sz="4"/>
+              <w:right w:val="single" w:color="8A8A8A" w:sz="4"/>
+            </w:tcBorders>
+            <w:tcMar>
+              <w:top w:type="dxa" w:w="60"/>
+              <w:left w:type="dxa" w:w="100"/>
+              <w:bottom w:type="dxa" w:w="60"/>
+              <w:right w:type="dxa" w:w="100"/>
+            </w:tcMar>
+            <w:vAlign w:val="top"/>
+          </w:tcPr>
+          <w:p>
+            <w:pPr>
+              <w:keepNext/>
+              <w:keepLines/>
+              <w:spacing w:after="0" w:line="264"/>
+            </w:pPr>
+            <w:r>
+              <w:t xml:space="preserve">What frustrates her</w:t>
+            </w:r>
+          </w:p>
+        </w:tc>
+        <w:tc>
+          <w:tcPr>
+            <w:tcW w:type="dxa" w:w="6426"/>
+            <w:tcBorders>
+              <w:top w:val="single" w:color="8A8A8A" w:sz="4"/>
+              <w:left w:val="single" w:color="8A8A8A" w:sz="4"/>
+              <w:bottom w:val="single" w:color="8A8A8A" w:sz="4"/>
+              <w:right w:val="single" w:color="8A8A8A" w:sz="4"/>
+            </w:tcBorders>
+            <w:tcMar>
+              <w:top w:type="dxa" w:w="60"/>
+              <w:left w:type="dxa" w:w="100"/>
+              <w:bottom w:type="dxa" w:w="60"/>
+              <w:right w:type="dxa" w:w="100"/>
+            </w:tcMar>
+            <w:vAlign w:val="top"/>
+          </w:tcPr>
+          <w:p>
+            <w:pPr>
+              <w:keepNext/>
+              <w:keepLines/>
+              <w:spacing w:after="0" w:line="264"/>
+            </w:pPr>
+            <w:r>
+              <w:t xml:space="preserve">Doctors who stop using the hospital system because it slows them down, leaving records incomplete</w:t>
+            </w:r>
+          </w:p>
+        </w:tc>
+      </w:tr>
+      <w:tr>
+        <w:trPr>
+          <w:cantSplit/>
+          <w:tblHeader w:val="false"/>
+        </w:trPr>
+        <w:tc>
+          <w:tcPr>
+            <w:tcW w:type="dxa" w:w="2600"/>
+            <w:tcBorders>
+              <w:top w:val="single" w:color="8A8A8A" w:sz="4"/>
+              <w:left w:val="single" w:color="8A8A8A" w:sz="4"/>
+              <w:bottom w:val="single" w:color="8A8A8A" w:sz="4"/>
+              <w:right w:val="single" w:color="8A8A8A" w:sz="4"/>
+            </w:tcBorders>
+            <w:tcMar>
+              <w:top w:type="dxa" w:w="60"/>
+              <w:left w:type="dxa" w:w="100"/>
+              <w:bottom w:type="dxa" w:w="60"/>
+              <w:right w:type="dxa" w:w="100"/>
+            </w:tcMar>
+            <w:vAlign w:val="top"/>
+          </w:tcPr>
+          <w:p>
+            <w:pPr>
+              <w:keepNext w:val="false"/>
+              <w:keepLines/>
+              <w:spacing w:after="0" w:line="264"/>
+            </w:pPr>
+            <w:r>
+              <w:t xml:space="preserve">What she will not accept</w:t>
+            </w:r>
+          </w:p>
+        </w:tc>
+        <w:tc>
+          <w:tcPr>
+            <w:tcW w:type="dxa" w:w="6426"/>
+            <w:tcBorders>
+              <w:top w:val="single" w:color="8A8A8A" w:sz="4"/>
+              <w:left w:val="single" w:color="8A8A8A" w:sz="4"/>
+              <w:bottom w:val="single" w:color="8A8A8A" w:sz="4"/>
+              <w:right w:val="single" w:color="8A8A8A" w:sz="4"/>
+            </w:tcBorders>
+            <w:tcMar>
+              <w:top w:type="dxa" w:w="60"/>
+              <w:left w:type="dxa" w:w="100"/>
+              <w:bottom w:type="dxa" w:w="60"/>
+              <w:right w:type="dxa" w:w="100"/>
+            </w:tcMar>
+            <w:vAlign w:val="top"/>
+          </w:tcPr>
+          <w:p>
+            <w:pPr>
+              <w:keepNext w:val="false"/>
+              <w:keepLines/>
+              <w:spacing w:after="0" w:line="264"/>
+            </w:pPr>
+            <w:r>
+              <w:t xml:space="preserve">Patient data leaving the institution's control, or a system the hospital cannot export from</w:t>
             </w:r>
           </w:p>
         </w:tc>
@@ -5956,7 +6341,7 @@
           <w:i/>
           <w:iCs/>
         </w:rPr>
-        <w:t xml:space="preserve">In single-doctor rural clinics, a consultation lasting roughly two minutes must produce both care and a record, and the record is routinely the part that is sacrificed. Existing clinical software addresses this by asking the doctor to type structured data during the consultation, which measurably consumes more of the doctor's attention than paper does and is consequently abandoned. Clinics are left with no usable patient history, unsystematic follow-up, and years of records resting on a single register or a single laptop — while any acceptable remedy must also avoid clinical judgements it is not permitted to make, and must protect consultation content that is legally sensitive personal data.</w:t>
+        <w:t xml:space="preserve">In busy outpatient practice — starting with the single-doctor clinic — a consultation lasting roughly two minutes must produce both care and a record, and the record is routinely the part that is sacrificed. Existing clinical software addresses this by asking the doctor to type structured data during the consultation, which measurably consumes more of the doctor's attention than paper does and is consequently abandoned. Clinics are left with no usable patient history, unsystematic follow-up, and years of records resting on a single register or a single laptop — while any acceptable remedy must also avoid clinical judgements it is not permitted to make, and must protect consultation content that is legally sensitive personal data.</w:t>
       </w:r>
     </w:p>
     <w:p>
@@ -5982,7 +6367,7 @@
           <w:i/>
           <w:iCs/>
         </w:rPr>
-        <w:t xml:space="preserve">Dr. Roy, a solo practitioner seeing 40–60 patients a day, needs a way to end each consultation with a usable written record without spending consultation time producing it — because the two minutes he has belong to the patient, and every second the record takes is taken from care.</w:t>
+        <w:t xml:space="preserve">Dr. Roy, a practitioner seeing 40–60 patients a day, needs a way to end each consultation with a usable written record without spending consultation time producing it — because the two minutes he has belong to the patient, and every second the record takes is taken from care.</w:t>
       </w:r>
     </w:p>
     <w:p>
@@ -12317,7 +12702,457 @@
         <w:keepNext/>
       </w:pPr>
       <w:r>
-        <w:t xml:space="preserve">5.4 Next Steps</w:t>
+        <w:t xml:space="preserve">5.4 The Scaling Path</w:t>
+      </w:r>
+    </w:p>
+    <w:p>
+      <w:pPr>
+        <w:spacing w:after="140" w:before="0" w:line="300"/>
+        <w:jc w:val="both"/>
+      </w:pPr>
+      <w:r>
+        <w:t xml:space="preserve">The implementation is staged so that each step builds on the one before it, rather than being rebuilt for a bigger customer:</w:t>
+      </w:r>
+    </w:p>
+    <w:tbl>
+      <w:tblPr>
+        <w:tblW w:type="dxa" w:w="9026"/>
+        <w:tblBorders>
+          <w:top w:val="single" w:color="auto" w:sz="4"/>
+          <w:left w:val="single" w:color="auto" w:sz="4"/>
+          <w:bottom w:val="single" w:color="auto" w:sz="4"/>
+          <w:right w:val="single" w:color="auto" w:sz="4"/>
+          <w:insideH w:val="single" w:color="auto" w:sz="4"/>
+          <w:insideV w:val="single" w:color="auto" w:sz="4"/>
+        </w:tblBorders>
+      </w:tblPr>
+      <w:tblGrid>
+        <w:gridCol w:w="1800"/>
+        <w:gridCol w:w="2900"/>
+        <w:gridCol w:w="4326"/>
+      </w:tblGrid>
+      <w:tr>
+        <w:trPr>
+          <w:cantSplit/>
+          <w:tblHeader/>
+        </w:trPr>
+        <w:tc>
+          <w:tcPr>
+            <w:tcW w:type="dxa" w:w="1800"/>
+            <w:tcBorders>
+              <w:top w:val="single" w:color="8A8A8A" w:sz="4"/>
+              <w:left w:val="single" w:color="8A8A8A" w:sz="4"/>
+              <w:bottom w:val="single" w:color="8A8A8A" w:sz="4"/>
+              <w:right w:val="single" w:color="8A8A8A" w:sz="4"/>
+            </w:tcBorders>
+            <w:shd w:fill="E3EEEC" w:color="auto" w:val="clear"/>
+            <w:tcMar>
+              <w:top w:type="dxa" w:w="60"/>
+              <w:left w:type="dxa" w:w="100"/>
+              <w:bottom w:type="dxa" w:w="60"/>
+              <w:right w:type="dxa" w:w="100"/>
+            </w:tcMar>
+            <w:vAlign w:val="top"/>
+          </w:tcPr>
+          <w:p>
+            <w:pPr>
+              <w:keepNext/>
+              <w:keepLines/>
+              <w:spacing w:after="0" w:line="264"/>
+            </w:pPr>
+            <w:r>
+              <w:rPr>
+                <w:b/>
+                <w:bCs/>
+              </w:rPr>
+              <w:t xml:space="preserve">Stage</w:t>
+            </w:r>
+          </w:p>
+        </w:tc>
+        <w:tc>
+          <w:tcPr>
+            <w:tcW w:type="dxa" w:w="2900"/>
+            <w:tcBorders>
+              <w:top w:val="single" w:color="8A8A8A" w:sz="4"/>
+              <w:left w:val="single" w:color="8A8A8A" w:sz="4"/>
+              <w:bottom w:val="single" w:color="8A8A8A" w:sz="4"/>
+              <w:right w:val="single" w:color="8A8A8A" w:sz="4"/>
+            </w:tcBorders>
+            <w:shd w:fill="E3EEEC" w:color="auto" w:val="clear"/>
+            <w:tcMar>
+              <w:top w:type="dxa" w:w="60"/>
+              <w:left w:type="dxa" w:w="100"/>
+              <w:bottom w:type="dxa" w:w="60"/>
+              <w:right w:type="dxa" w:w="100"/>
+            </w:tcMar>
+            <w:vAlign w:val="top"/>
+          </w:tcPr>
+          <w:p>
+            <w:pPr>
+              <w:keepNext/>
+              <w:keepLines/>
+              <w:spacing w:after="0" w:line="264"/>
+            </w:pPr>
+            <w:r>
+              <w:rPr>
+                <w:b/>
+                <w:bCs/>
+              </w:rPr>
+              <w:t xml:space="preserve">Who it serves</w:t>
+            </w:r>
+          </w:p>
+        </w:tc>
+        <w:tc>
+          <w:tcPr>
+            <w:tcW w:type="dxa" w:w="4326"/>
+            <w:tcBorders>
+              <w:top w:val="single" w:color="8A8A8A" w:sz="4"/>
+              <w:left w:val="single" w:color="8A8A8A" w:sz="4"/>
+              <w:bottom w:val="single" w:color="8A8A8A" w:sz="4"/>
+              <w:right w:val="single" w:color="8A8A8A" w:sz="4"/>
+            </w:tcBorders>
+            <w:shd w:fill="E3EEEC" w:color="auto" w:val="clear"/>
+            <w:tcMar>
+              <w:top w:type="dxa" w:w="60"/>
+              <w:left w:type="dxa" w:w="100"/>
+              <w:bottom w:type="dxa" w:w="60"/>
+              <w:right w:type="dxa" w:w="100"/>
+            </w:tcMar>
+            <w:vAlign w:val="top"/>
+          </w:tcPr>
+          <w:p>
+            <w:pPr>
+              <w:keepNext/>
+              <w:keepLines/>
+              <w:spacing w:after="0" w:line="264"/>
+            </w:pPr>
+            <w:r>
+              <w:rPr>
+                <w:b/>
+                <w:bCs/>
+              </w:rPr>
+              <w:t xml:space="preserve">What it needs (and what is already built)</w:t>
+            </w:r>
+          </w:p>
+        </w:tc>
+      </w:tr>
+      <w:tr>
+        <w:trPr>
+          <w:cantSplit/>
+          <w:tblHeader w:val="false"/>
+        </w:trPr>
+        <w:tc>
+          <w:tcPr>
+            <w:tcW w:type="dxa" w:w="1800"/>
+            <w:tcBorders>
+              <w:top w:val="single" w:color="8A8A8A" w:sz="4"/>
+              <w:left w:val="single" w:color="8A8A8A" w:sz="4"/>
+              <w:bottom w:val="single" w:color="8A8A8A" w:sz="4"/>
+              <w:right w:val="single" w:color="8A8A8A" w:sz="4"/>
+            </w:tcBorders>
+            <w:tcMar>
+              <w:top w:type="dxa" w:w="60"/>
+              <w:left w:type="dxa" w:w="100"/>
+              <w:bottom w:type="dxa" w:w="60"/>
+              <w:right w:type="dxa" w:w="100"/>
+            </w:tcMar>
+            <w:vAlign w:val="top"/>
+          </w:tcPr>
+          <w:p>
+            <w:pPr>
+              <w:keepNext/>
+              <w:keepLines/>
+              <w:spacing w:after="0" w:line="264"/>
+            </w:pPr>
+            <w:r>
+              <w:t xml:space="preserve">1. Clinics</w:t>
+            </w:r>
+          </w:p>
+        </w:tc>
+        <w:tc>
+          <w:tcPr>
+            <w:tcW w:type="dxa" w:w="2900"/>
+            <w:tcBorders>
+              <w:top w:val="single" w:color="8A8A8A" w:sz="4"/>
+              <w:left w:val="single" w:color="8A8A8A" w:sz="4"/>
+              <w:bottom w:val="single" w:color="8A8A8A" w:sz="4"/>
+              <w:right w:val="single" w:color="8A8A8A" w:sz="4"/>
+            </w:tcBorders>
+            <w:tcMar>
+              <w:top w:type="dxa" w:w="60"/>
+              <w:left w:type="dxa" w:w="100"/>
+              <w:bottom w:type="dxa" w:w="60"/>
+              <w:right w:type="dxa" w:w="100"/>
+            </w:tcMar>
+            <w:vAlign w:val="top"/>
+          </w:tcPr>
+          <w:p>
+            <w:pPr>
+              <w:keepNext/>
+              <w:keepLines/>
+              <w:spacing w:after="0" w:line="264"/>
+            </w:pPr>
+            <w:r>
+              <w:t xml:space="preserve">Single-doctor and small practices</w:t>
+            </w:r>
+          </w:p>
+        </w:tc>
+        <w:tc>
+          <w:tcPr>
+            <w:tcW w:type="dxa" w:w="4326"/>
+            <w:tcBorders>
+              <w:top w:val="single" w:color="8A8A8A" w:sz="4"/>
+              <w:left w:val="single" w:color="8A8A8A" w:sz="4"/>
+              <w:bottom w:val="single" w:color="8A8A8A" w:sz="4"/>
+              <w:right w:val="single" w:color="8A8A8A" w:sz="4"/>
+            </w:tcBorders>
+            <w:tcMar>
+              <w:top w:type="dxa" w:w="60"/>
+              <w:left w:type="dxa" w:w="100"/>
+              <w:bottom w:type="dxa" w:w="60"/>
+              <w:right w:type="dxa" w:w="100"/>
+            </w:tcMar>
+            <w:vAlign w:val="top"/>
+          </w:tcPr>
+          <w:p>
+            <w:pPr>
+              <w:keepNext/>
+              <w:keepLines/>
+              <w:spacing w:after="0" w:line="264"/>
+            </w:pPr>
+            <w:r>
+              <w:t xml:space="preserve">The consultation flow, records, front desk, billing, follow-up and prescriptions — </w:t>
+            </w:r>
+            <w:r>
+              <w:rPr>
+                <w:b/>
+                <w:bCs/>
+              </w:rPr>
+              <w:t xml:space="preserve">built</w:t>
+            </w:r>
+          </w:p>
+        </w:tc>
+      </w:tr>
+      <w:tr>
+        <w:trPr>
+          <w:cantSplit/>
+          <w:tblHeader w:val="false"/>
+        </w:trPr>
+        <w:tc>
+          <w:tcPr>
+            <w:tcW w:type="dxa" w:w="1800"/>
+            <w:tcBorders>
+              <w:top w:val="single" w:color="8A8A8A" w:sz="4"/>
+              <w:left w:val="single" w:color="8A8A8A" w:sz="4"/>
+              <w:bottom w:val="single" w:color="8A8A8A" w:sz="4"/>
+              <w:right w:val="single" w:color="8A8A8A" w:sz="4"/>
+            </w:tcBorders>
+            <w:tcMar>
+              <w:top w:type="dxa" w:w="60"/>
+              <w:left w:type="dxa" w:w="100"/>
+              <w:bottom w:type="dxa" w:w="60"/>
+              <w:right w:type="dxa" w:w="100"/>
+            </w:tcMar>
+            <w:vAlign w:val="top"/>
+          </w:tcPr>
+          <w:p>
+            <w:pPr>
+              <w:keepNext/>
+              <w:keepLines/>
+              <w:spacing w:after="0" w:line="264"/>
+            </w:pPr>
+            <w:r>
+              <w:t xml:space="preserve">2. Larger institutions</w:t>
+            </w:r>
+          </w:p>
+        </w:tc>
+        <w:tc>
+          <w:tcPr>
+            <w:tcW w:type="dxa" w:w="2900"/>
+            <w:tcBorders>
+              <w:top w:val="single" w:color="8A8A8A" w:sz="4"/>
+              <w:left w:val="single" w:color="8A8A8A" w:sz="4"/>
+              <w:bottom w:val="single" w:color="8A8A8A" w:sz="4"/>
+              <w:right w:val="single" w:color="8A8A8A" w:sz="4"/>
+            </w:tcBorders>
+            <w:tcMar>
+              <w:top w:type="dxa" w:w="60"/>
+              <w:left w:type="dxa" w:w="100"/>
+              <w:bottom w:type="dxa" w:w="60"/>
+              <w:right w:type="dxa" w:w="100"/>
+            </w:tcMar>
+            <w:vAlign w:val="top"/>
+          </w:tcPr>
+          <w:p>
+            <w:pPr>
+              <w:keepNext/>
+              <w:keepLines/>
+              <w:spacing w:after="0" w:line="264"/>
+            </w:pPr>
+            <w:r>
+              <w:t xml:space="preserve">Multi-doctor clinics, polyclinics, hospital outpatient departments, health systems</w:t>
+            </w:r>
+          </w:p>
+        </w:tc>
+        <w:tc>
+          <w:tcPr>
+            <w:tcW w:type="dxa" w:w="4326"/>
+            <w:tcBorders>
+              <w:top w:val="single" w:color="8A8A8A" w:sz="4"/>
+              <w:left w:val="single" w:color="8A8A8A" w:sz="4"/>
+              <w:bottom w:val="single" w:color="8A8A8A" w:sz="4"/>
+              <w:right w:val="single" w:color="8A8A8A" w:sz="4"/>
+            </w:tcBorders>
+            <w:tcMar>
+              <w:top w:type="dxa" w:w="60"/>
+              <w:left w:type="dxa" w:w="100"/>
+              <w:bottom w:type="dxa" w:w="60"/>
+              <w:right w:type="dxa" w:w="100"/>
+            </w:tcMar>
+            <w:vAlign w:val="top"/>
+          </w:tcPr>
+          <w:p>
+            <w:pPr>
+              <w:keepNext/>
+              <w:keepLines/>
+              <w:spacing w:after="0" w:line="264"/>
+            </w:pPr>
+            <w:r>
+              <w:t xml:space="preserve">Roles and permissions, many clinics in one account, an activity log, sync between a site's own computer and the cloud, full export — </w:t>
+            </w:r>
+            <w:r>
+              <w:rPr>
+                <w:b/>
+                <w:bCs/>
+              </w:rPr>
+              <w:t xml:space="preserve">foundations built</w:t>
+            </w:r>
+            <w:r>
+              <w:t xml:space="preserve">; integrations with hospital systems to come</w:t>
+            </w:r>
+          </w:p>
+        </w:tc>
+      </w:tr>
+      <w:tr>
+        <w:trPr>
+          <w:cantSplit/>
+          <w:tblHeader w:val="false"/>
+        </w:trPr>
+        <w:tc>
+          <w:tcPr>
+            <w:tcW w:type="dxa" w:w="1800"/>
+            <w:tcBorders>
+              <w:top w:val="single" w:color="8A8A8A" w:sz="4"/>
+              <w:left w:val="single" w:color="8A8A8A" w:sz="4"/>
+              <w:bottom w:val="single" w:color="8A8A8A" w:sz="4"/>
+              <w:right w:val="single" w:color="8A8A8A" w:sz="4"/>
+            </w:tcBorders>
+            <w:tcMar>
+              <w:top w:type="dxa" w:w="60"/>
+              <w:left w:type="dxa" w:w="100"/>
+              <w:bottom w:type="dxa" w:w="60"/>
+              <w:right w:type="dxa" w:w="100"/>
+            </w:tcMar>
+            <w:vAlign w:val="top"/>
+          </w:tcPr>
+          <w:p>
+            <w:pPr>
+              <w:keepNext w:val="false"/>
+              <w:keepLines/>
+              <w:spacing w:after="0" w:line="264"/>
+            </w:pPr>
+            <w:r>
+              <w:t xml:space="preserve">3. International</w:t>
+            </w:r>
+          </w:p>
+        </w:tc>
+        <w:tc>
+          <w:tcPr>
+            <w:tcW w:type="dxa" w:w="2900"/>
+            <w:tcBorders>
+              <w:top w:val="single" w:color="8A8A8A" w:sz="4"/>
+              <w:left w:val="single" w:color="8A8A8A" w:sz="4"/>
+              <w:bottom w:val="single" w:color="8A8A8A" w:sz="4"/>
+              <w:right w:val="single" w:color="8A8A8A" w:sz="4"/>
+            </w:tcBorders>
+            <w:tcMar>
+              <w:top w:type="dxa" w:w="60"/>
+              <w:left w:type="dxa" w:w="100"/>
+              <w:bottom w:type="dxa" w:w="60"/>
+              <w:right w:type="dxa" w:w="100"/>
+            </w:tcMar>
+            <w:vAlign w:val="top"/>
+          </w:tcPr>
+          <w:p>
+            <w:pPr>
+              <w:keepNext w:val="false"/>
+              <w:keepLines/>
+              <w:spacing w:after="0" w:line="264"/>
+            </w:pPr>
+            <w:r>
+              <w:t xml:space="preserve">Healthcare providers outside India</w:t>
+            </w:r>
+          </w:p>
+        </w:tc>
+        <w:tc>
+          <w:tcPr>
+            <w:tcW w:type="dxa" w:w="4326"/>
+            <w:tcBorders>
+              <w:top w:val="single" w:color="8A8A8A" w:sz="4"/>
+              <w:left w:val="single" w:color="8A8A8A" w:sz="4"/>
+              <w:bottom w:val="single" w:color="8A8A8A" w:sz="4"/>
+              <w:right w:val="single" w:color="8A8A8A" w:sz="4"/>
+            </w:tcBorders>
+            <w:tcMar>
+              <w:top w:type="dxa" w:w="60"/>
+              <w:left w:type="dxa" w:w="100"/>
+              <w:bottom w:type="dxa" w:w="60"/>
+              <w:right w:type="dxa" w:w="100"/>
+            </w:tcMar>
+            <w:vAlign w:val="top"/>
+          </w:tcPr>
+          <w:p>
+            <w:pPr>
+              <w:keepNext w:val="false"/>
+              <w:keepLines/>
+              <w:spacing w:after="0" w:line="264"/>
+            </w:pPr>
+            <w:r>
+              <w:t xml:space="preserve">More languages, data stored in each region, and each market's privacy and medical-device rules — </w:t>
+            </w:r>
+            <w:r>
+              <w:rPr>
+                <w:b/>
+                <w:bCs/>
+              </w:rPr>
+              <w:t xml:space="preserve">planned</w:t>
+            </w:r>
+          </w:p>
+        </w:tc>
+      </w:tr>
+    </w:tbl>
+    <w:p>
+      <w:pPr>
+        <w:spacing w:after="120"/>
+      </w:pPr>
+    </w:p>
+    <w:p>
+      <w:pPr>
+        <w:pStyle w:val="Heading2"/>
+        <w:keepNext/>
+      </w:pPr>
+      <w:r>
+        <w:t xml:space="preserve">5.5 Next Steps</w:t>
+      </w:r>
+    </w:p>
+    <w:p>
+      <w:pPr>
+        <w:keepNext/>
+        <w:spacing w:after="140" w:before="0" w:line="300"/>
+        <w:jc w:val="both"/>
+      </w:pPr>
+      <w:r>
+        <w:t xml:space="preserve">Building further features before the interviews is the project's main risk, so the next step is to listen — to doctors and institutions of every size:</w:t>
       </w:r>
     </w:p>
     <w:tbl>
@@ -12499,7 +13334,7 @@
               <w:spacing w:after="0" w:line="264"/>
             </w:pPr>
             <w:r>
-              <w:t xml:space="preserve">Carry out the 20 discovery interviews with the script in Section 1.2</w:t>
+              <w:t xml:space="preserve">Carry out the 20 discovery interviews, across practice sizes, with the script in Section 1.2</w:t>
             </w:r>
           </w:p>
         </w:tc>
@@ -12807,15 +13642,6 @@
       <w:pPr>
         <w:spacing w:after="120"/>
       </w:pPr>
-    </w:p>
-    <w:p>
-      <w:pPr>
-        <w:spacing w:after="140" w:before="0" w:line="300"/>
-        <w:jc w:val="both"/>
-      </w:pPr>
-      <w:r>
-        <w:t xml:space="preserve">Building further features before these interviews is the project's main risk. The next step is to listen.</w:t>
-      </w:r>
     </w:p>
     <w:p>
       <w:pPr>
@@ -14140,7 +14966,7 @@
         <w:jc w:val="both"/>
       </w:pPr>
       <w:r>
-        <w:t xml:space="preserve">Design thinking changed what ClinicOS is. We started by assuming that rural clinics were offline and that an electronic record would fix the paperwork. The Empathize stage broke both assumptions: the real constraint is what a dropped connection costs mid-consultation, and software that makes a doctor type takes time instead of returning it. The Define stage turned that into one problem statement and a point of view centred on the doctor's two minutes. The Ideate stage produced 37 ideas and rejected three of four directions on evidence. The Prototype stage produced working software tested by hundreds of automated checks, and the Implement stage turned it into a product a whole clinic can run — with its ethical limits enforced in code rather than in a policy document.</w:t>
+        <w:t xml:space="preserve">Design thinking changed what ClinicOS is. We started by assuming that clinics were offline and that an electronic record would fix the paperwork. The Empathize stage broke both assumptions: the real constraint is what a dropped connection costs mid-consultation, and software that makes a doctor type takes time instead of returning it. The Define stage turned that into one problem statement and a point of view centred on the doctor's two minutes. The Ideate stage produced 37 ideas and rejected three of four directions on evidence. The Prototype stage produced working software tested by hundreds of automated checks, and the Implement stage turned it into a product a whole clinic can run — with its ethical limits enforced in code rather than in a policy document.</w:t>
       </w:r>
     </w:p>
     <w:p>

</xml_diff>

<commit_message>
Bring every deck and document in artifacts/ up to the current plan
ClinicOS now runs online as a service or on a clinic's own computer, and
grows from single-doctor clinics to hospitals, health systems and
international markets. The decks, the report, the blueprint, the pilot
tracker, the blueprint page and the older PDFs no longer pitch it as an
offline, no-cloud tool for rural clinics or name the first field site.

Co-Authored-By: Claude Opus 5.5 <noreply@anthropic.com>
Claude-Session: https://claude.ai/code/session_012tam43Wrx3VFhnLz3rDLzg
</commit_message>
<xml_diff>
--- a/artifacts/ClinicOS_DesignThinking_Report.docx
+++ b/artifacts/ClinicOS_DesignThinking_Report.docx
@@ -8188,7 +8188,7 @@
               <w:spacing w:after="0" w:line="264"/>
             </w:pPr>
             <w:r>
-              <w:t xml:space="preserve">A cloud AI scribe</w:t>
+              <w:t xml:space="preserve">A scribe locked to one cloud</w:t>
             </w:r>
           </w:p>
         </w:tc>
@@ -8216,7 +8216,7 @@
               <w:spacing w:after="0" w:line="264"/>
             </w:pPr>
             <w:r>
-              <w:t xml:space="preserve">Audio uploaded to a remote service for transcription and drafting</w:t>
+              <w:t xml:space="preserve">Audio always sent to one vendor's remote service</w:t>
             </w:r>
           </w:p>
         </w:tc>
@@ -8244,7 +8244,7 @@
               <w:spacing w:after="0" w:line="264"/>
             </w:pPr>
             <w:r>
-              <w:t xml:space="preserve">Rejected as the default: sends the most sensitive audio a clinic produces off the premises, and stops when the link drops</w:t>
+              <w:t xml:space="preserve">Rejected: gives the clinic no say over where its most sensitive audio goes, and stops when the link drops</w:t>
             </w:r>
           </w:p>
         </w:tc>
@@ -8278,7 +8278,7 @@
               <w:spacing w:after="0" w:line="264"/>
             </w:pPr>
             <w:r>
-              <w:t xml:space="preserve">An on-device ambient scribe</w:t>
+              <w:t xml:space="preserve">An ambient scribe the clinic controls</w:t>
             </w:r>
           </w:p>
         </w:tc>
@@ -8306,7 +8306,7 @@
               <w:spacing w:after="0" w:line="264"/>
             </w:pPr>
             <w:r>
-              <w:t xml:space="preserve">Listens to the consultation already happening, drafts the note locally, asks the doctor only to review and sign</w:t>
+              <w:t xml:space="preserve">Listens to the consultation already happening, drafts the note on the clinic's computer or a hosted service it chooses, asks the doctor only to review and sign</w:t>
             </w:r>
           </w:p>
         </w:tc>
@@ -8519,7 +8519,7 @@
                 <w:b/>
                 <w:bCs/>
               </w:rPr>
-              <w:t xml:space="preserve">Cloud AI scribe</w:t>
+              <w:t xml:space="preserve">Locked-cloud scribe</w:t>
             </w:r>
           </w:p>
         </w:tc>
@@ -8552,7 +8552,7 @@
                 <w:b/>
                 <w:bCs/>
               </w:rPr>
-              <w:t xml:space="preserve">On-device scribe</w:t>
+              <w:t xml:space="preserve">Clinic-controlled scribe</w:t>
             </w:r>
           </w:p>
         </w:tc>
@@ -9846,7 +9846,7 @@
         <w:jc w:val="both"/>
       </w:pPr>
       <w:r>
-        <w:t xml:space="preserve">The prototype is a working application that runs on an ordinary clinic laptop with no internet connection. A consultation moves through four steps:</w:t>
+        <w:t xml:space="preserve">The prototype is a working application that runs online as a service, or on a clinic's own computer — where it keeps working even without internet. A consultation moves through four steps:</w:t>
       </w:r>
     </w:p>
     <w:tbl>
@@ -10146,7 +10146,7 @@
               <w:spacing w:after="0" w:line="264"/>
             </w:pPr>
             <w:r>
-              <w:t xml:space="preserve">Converts speech to text on the clinic's own computer (faster-whisper)</w:t>
+              <w:t xml:space="preserve">Converts speech to text — on the clinic's own computer (faster-whisper) or through a hosted service</w:t>
             </w:r>
           </w:p>
         </w:tc>
@@ -10236,7 +10236,7 @@
               <w:spacing w:after="0" w:line="264"/>
             </w:pPr>
             <w:r>
-              <w:t xml:space="preserve">Drafts a structured note — complaint, history, examination, diagnosis, medicines, tests, advice — using a local language model (Qwen 2.5, 7B, through Ollama)</w:t>
+              <w:t xml:space="preserve">Drafts a structured note — complaint, history, examination, diagnosis, medicines, tests, advice — using a language model — locally (Qwen 2.5, 7B, through Ollama) or hosted</w:t>
             </w:r>
           </w:p>
         </w:tc>

</xml_diff>